<commit_message>
feat: add multi-series support and 2d nmr example
</commit_message>
<xml_diff>
--- a/examples/example_1/Reference_output.docx
+++ b/examples/example_1/Reference_output.docx
@@ -12,7 +12,7 @@
         <w:drawing>
           <ns1:inline>
             <ns1:extent cx="5972810" cy="3040214"/>
-            <ns1:docPr id="13" name="Picture 13"/>
+            <ns1:docPr id="9" name="Picture 9"/>
             <ns1:cNvGraphicFramePr>
               <ns2:graphicFrameLocks noChangeAspect="1"/>
             </ns1:cNvGraphicFramePr>
@@ -24,7 +24,7 @@
                     <ns3:cNvPicPr/>
                   </ns3:nvPicPr>
                   <ns3:blipFill>
-                    <ns2:blip r:embed="rId46"/>
+                    <ns2:blip r:embed="rId42"/>
                     <ns2:stretch>
                       <ns2:fillRect/>
                     </ns2:stretch>
@@ -118,10 +118,10 @@
             <o:lock v:ext="edit" aspectratio="t"/>
           </v:shapetype>
           <v:shape id="_x0000_i1025" type="#_x0000_t75" style="position:absolute;left:0;text-align:left;margin-left:0pt;margin-top:12pt;width:83.25pt;height:64.5pt;z-index:251659264" o:ole="" o:allowoverlap="f">
-            <v:imagedata r:id="rIdSI47" o:title=""/>
+            <v:imagedata r:id="rIdSI43" o:title=""/>
             <w10:wrap type="square" side="right"/>
           </v:shape>
-          <o:OLEObject Type="Embed" ProgID="ChemDraw.Document" ShapeID="_x0000_i1025" DrawAspect="Content" ObjectID="_1851838593" r:id="rIdSI48"/>
+          <o:OLEObject Type="Embed" ProgID="ChemDraw.Document" ShapeID="_x0000_i1025" DrawAspect="Content" ObjectID="_1851838593" r:id="rIdSI44"/>
         </w:object>
       </w:r>
     </w:p>
@@ -404,59 +404,6 @@
       </w:r>
       <w:proofErr w:type="gramStart"/>
       <w:proofErr w:type="gramEnd"/>
-    </w:p>
-    <w:p>
-      <w:pPr>
-        <w:keepNext/>
-      </w:pPr>
-      <w:r>
-        <w:drawing>
-          <ns1:inline>
-            <ns1:extent cx="4389120" cy="469277"/>
-            <ns1:docPr id="1" name="Picture 1"/>
-            <ns1:cNvGraphicFramePr>
-              <ns2:graphicFrameLocks noChangeAspect="1"/>
-            </ns1:cNvGraphicFramePr>
-            <ns2:graphic>
-              <ns2:graphicData uri="http://schemas.openxmlformats.org/drawingml/2006/picture">
-                <ns3:pic>
-                  <ns3:nvPicPr>
-                    <ns3:cNvPr id="0" name="structure_1_1.png"/>
-                    <ns3:cNvPicPr/>
-                  </ns3:nvPicPr>
-                  <ns3:blipFill>
-                    <ns2:blip r:embed="rId34"/>
-                    <ns2:stretch>
-                      <ns2:fillRect/>
-                    </ns2:stretch>
-                  </ns3:blipFill>
-                  <ns3:spPr>
-                    <ns2:xfrm>
-                      <ns2:off x="0" y="0"/>
-                      <ns2:ext cx="4389120" cy="469277"/>
-                    </ns2:xfrm>
-                    <ns2:prstGeom prst="rect"/>
-                  </ns3:spPr>
-                </ns3:pic>
-              </ns2:graphicData>
-            </ns2:graphic>
-          </ns1:inline>
-        </w:drawing>
-      </w:r>
-    </w:p>
-    <w:p>
-      <w:pPr>
-        <w:keepLines/>
-      </w:pPr>
-      <w:r>
-        <w:t xml:space="preserve">Crystal structure of </w:t>
-      </w:r>
-      <w:r>
-        <w:t>2a</w:t>
-      </w:r>
-      <w:r>
-        <w:t>. Coordinate-derived ball-and-stick view of the asymmetric unit; hydrogen atoms omitted. Not a thermal-ellipsoid plot; review inferred connectivity and supply an ORTEP plot for submission.</w:t>
-      </w:r>
       <w:bookmarkEnd w:id="2606323135"/>
     </w:p>
     <w:p/>
@@ -510,10 +457,10 @@
       <w:r>
         <w:object w:dxaOrig="1963" w:dyaOrig="1289">
           <v:shape id="_x0000_i1026" type="#_x0000_t75" style="position:absolute;left:0;text-align:left;margin-left:0pt;margin-top:12pt;width:98.25pt;height:64.5pt;z-index:251659264" o:ole="" o:allowoverlap="f">
-            <v:imagedata r:id="rIdSI59" o:title=""/>
+            <v:imagedata r:id="rIdSI49" o:title=""/>
             <w10:wrap type="square" side="right"/>
           </v:shape>
-          <o:OLEObject Type="Embed" ProgID="ChemDraw.Document" ShapeID="_x0000_i1026" DrawAspect="Content" ObjectID="_1851838594" r:id="rIdSI60"/>
+          <o:OLEObject Type="Embed" ProgID="ChemDraw.Document" ShapeID="_x0000_i1026" DrawAspect="Content" ObjectID="_1851838594" r:id="rIdSI50"/>
         </w:object>
       </w:r>
     </w:p>
@@ -987,10 +934,10 @@
       <w:r>
         <w:object w:dxaOrig="1965" w:dyaOrig="1289">
           <v:shape id="_x0000_i1027" type="#_x0000_t75" style="position:absolute;left:0;text-align:left;margin-left:0pt;margin-top:12pt;width:98.25pt;height:64.5pt;z-index:251659264" o:ole="" o:allowoverlap="f">
-            <v:imagedata r:id="rIdSI65" o:title=""/>
+            <v:imagedata r:id="rIdSI55" o:title=""/>
             <w10:wrap type="square" side="right"/>
           </v:shape>
-          <o:OLEObject Type="Embed" ProgID="ChemDraw.Document" ShapeID="_x0000_i1027" DrawAspect="Content" ObjectID="_1851838595" r:id="rIdSI66"/>
+          <o:OLEObject Type="Embed" ProgID="ChemDraw.Document" ShapeID="_x0000_i1027" DrawAspect="Content" ObjectID="_1851838595" r:id="rIdSI56"/>
         </w:object>
       </w:r>
     </w:p>
@@ -1476,10 +1423,10 @@
       <w:r>
         <w:object w:dxaOrig="2216" w:dyaOrig="1289">
           <v:shape id="_x0000_i1028" type="#_x0000_t75" style="position:absolute;left:0;text-align:left;margin-left:0pt;margin-top:12pt;width:111pt;height:64.5pt;z-index:251659264" o:ole="" o:allowoverlap="f">
-            <v:imagedata r:id="rIdSI71" o:title=""/>
+            <v:imagedata r:id="rIdSI61" o:title=""/>
             <w10:wrap type="square" side="right"/>
           </v:shape>
-          <o:OLEObject Type="Embed" ProgID="ChemDraw.Document" ShapeID="_x0000_i1028" DrawAspect="Content" ObjectID="_1851838596" r:id="rIdSI72"/>
+          <o:OLEObject Type="Embed" ProgID="ChemDraw.Document" ShapeID="_x0000_i1028" DrawAspect="Content" ObjectID="_1851838596" r:id="rIdSI62"/>
         </w:object>
       </w:r>
     </w:p>
@@ -1901,1532 +1848,6 @@
         <w:t>.</w:t>
       </w:r>
       <w:bookmarkEnd w:id="2489178869"/>
-    </w:p>
-    <w:p>
-      <w:r>
-        <w:br w:type="page"/>
-      </w:r>
-    </w:p>
-    <w:p>
-      <w:pPr>
-        <w:spacing w:after="0"/>
-      </w:pPr>
-      <w:r>
-        <w:rPr>
-          <w:b/>
-        </w:rPr>
-        <w:t>X-ray crystallography</w:t>
-      </w:r>
-    </w:p>
-    <w:p>
-      <w:pPr>
-        <w:keepNext/>
-        <w:pageBreakBefore w:val="0"/>
-      </w:pPr>
-      <w:bookmarkStart w:id="958759905" w:name="asig_crystallography_cmp_001_16f035bf"/>
-      <w:r>
-        <w:rPr>
-          <w:b/>
-          <w:color w:val="000000"/>
-        </w:rPr>
-        <w:t>Methyl (E)-3-(2-(bromomethyl)phenyl)acrylate (</w:t>
-      </w:r>
-      <w:r>
-        <w:rPr>
-          <w:b/>
-          <w:color w:val="000000"/>
-        </w:rPr>
-        <w:t>2a</w:t>
-      </w:r>
-      <w:r>
-        <w:rPr>
-          <w:b/>
-          <w:color w:val="000000"/>
-        </w:rPr>
-        <w:t>)</w:t>
-      </w:r>
-    </w:p>
-    <w:p>
-      <w:r>
-        <w:t>Single-crystal X-ray diffraction data were collected with MoKα (λ = 0.71073) at 100(2) K.</w:t>
-      </w:r>
-    </w:p>
-    <w:p>
-      <w:pPr>
-        <w:keepNext/>
-        <w:spacing w:after="100"/>
-      </w:pPr>
-      <w:r>
-        <w:rPr>
-          <w:b/>
-        </w:rPr>
-        <w:t>Table S</w:t>
-      </w:r>
-      <w:fldSimple w:instr="SEQ ASGCrystalTable \* ARABIC">
-        <w:r>
-          <w:rPr>
-            <w:b/>
-          </w:rPr>
-          <w:t>1</w:t>
-        </w:r>
-      </w:fldSimple>
-      <w:r>
-        <w:rPr>
-          <w:b/>
-        </w:rPr>
-        <w:t>.</w:t>
-      </w:r>
-      <w:r>
-        <w:t xml:space="preserve"> Crystal data and structure refinement for compound </w:t>
-      </w:r>
-      <w:r>
-        <w:rPr>
-          <w:b/>
-        </w:rPr>
-        <w:t>2a</w:t>
-      </w:r>
-      <w:r>
-        <w:t>.</w:t>
-      </w:r>
-    </w:p>
-    <w:tbl>
-      <w:tblPr>
-        <w:tblW w:type="auto" w:w="0"/>
-        <w:jc w:val="center"/>
-        <w:tblLayout w:type="fixed"/>
-        <w:tblLook w:firstColumn="1" w:firstRow="1" w:lastColumn="0" w:lastRow="0" w:noHBand="0" w:noVBand="1" w:val="04A0"/>
-        <w:tblBorders>
-          <w:top w:val="single" w:sz="4" w:color="808080"/>
-          <w:bottom w:val="single" w:sz="4" w:color="808080"/>
-          <w:left w:val="nil" w:sz="4" w:color="808080"/>
-          <w:right w:val="nil" w:sz="4" w:color="808080"/>
-          <w:insideH w:val="nil" w:sz="4" w:color="808080"/>
-          <w:insideV w:val="nil" w:sz="4" w:color="808080"/>
-        </w:tblBorders>
-      </w:tblPr>
-      <w:tblGrid>
-        <w:gridCol w:w="4083"/>
-        <w:gridCol w:w="3621"/>
-      </w:tblGrid>
-      <w:tr>
-        <w:trPr>
-          <w:cantSplit/>
-        </w:trPr>
-        <w:tc>
-          <w:tcPr>
-            <w:tcW w:type="dxa" w:w="4083"/>
-            <w:vAlign w:val="center"/>
-          </w:tcPr>
-          <w:p>
-            <w:pPr>
-              <w:keepNext w:val="0"/>
-              <w:spacing w:after="20" w:before="0" w:line="240" w:lineRule="auto"/>
-              <w:ind w:left="0" w:right="0" w:firstLine="0"/>
-              <w:jc w:val="center"/>
-            </w:pPr>
-            <w:r>
-              <w:rPr>
-                <w:rFonts w:ascii="Times New Roman" w:hAnsi="Times New Roman"/>
-                <w:b w:val="0"/>
-                <w:sz w:val="20"/>
-              </w:rPr>
-              <w:t>Identification code</w:t>
-            </w:r>
-          </w:p>
-        </w:tc>
-        <w:tc>
-          <w:tcPr>
-            <w:tcW w:type="dxa" w:w="3621"/>
-            <w:vAlign w:val="center"/>
-          </w:tcPr>
-          <w:p>
-            <w:pPr>
-              <w:keepNext w:val="0"/>
-              <w:spacing w:after="20" w:before="0" w:line="240" w:lineRule="auto"/>
-              <w:ind w:left="0" w:right="0" w:firstLine="0"/>
-              <w:jc w:val="center"/>
-            </w:pPr>
-            <w:r>
-              <w:rPr>
-                <w:rFonts w:ascii="Times New Roman" w:hAnsi="Times New Roman"/>
-                <w:b w:val="0"/>
-                <w:sz w:val="20"/>
-              </w:rPr>
-              <w:t>demo</w:t>
-            </w:r>
-          </w:p>
-        </w:tc>
-      </w:tr>
-      <w:tr>
-        <w:trPr>
-          <w:cantSplit/>
-        </w:trPr>
-        <w:tc>
-          <w:tcPr>
-            <w:tcW w:type="dxa" w:w="4083"/>
-            <w:vAlign w:val="center"/>
-          </w:tcPr>
-          <w:p>
-            <w:pPr>
-              <w:keepNext w:val="0"/>
-              <w:spacing w:after="20" w:before="0" w:line="240" w:lineRule="auto"/>
-              <w:ind w:left="0" w:right="0" w:firstLine="0"/>
-              <w:jc w:val="center"/>
-            </w:pPr>
-            <w:r>
-              <w:rPr>
-                <w:rFonts w:ascii="Times New Roman" w:hAnsi="Times New Roman"/>
-                <w:b w:val="0"/>
-                <w:sz w:val="20"/>
-              </w:rPr>
-              <w:t>Empirical formula</w:t>
-            </w:r>
-          </w:p>
-        </w:tc>
-        <w:tc>
-          <w:tcPr>
-            <w:tcW w:type="dxa" w:w="3621"/>
-            <w:vAlign w:val="center"/>
-          </w:tcPr>
-          <w:p>
-            <w:pPr>
-              <w:keepNext w:val="0"/>
-              <w:spacing w:after="20" w:before="0" w:line="240" w:lineRule="auto"/>
-              <w:ind w:left="0" w:right="0" w:firstLine="0"/>
-              <w:jc w:val="center"/>
-            </w:pPr>
-            <w:r>
-              <w:rPr>
-                <w:rFonts w:ascii="Times New Roman" w:hAnsi="Times New Roman"/>
-                <w:b w:val="0"/>
-                <w:sz w:val="20"/>
-              </w:rPr>
-              <w:t>C</w:t>
-            </w:r>
-            <w:r>
-              <w:rPr>
-                <w:rFonts w:ascii="Times New Roman" w:hAnsi="Times New Roman"/>
-                <w:b w:val="0"/>
-                <w:sz w:val="20"/>
-                <w:vertAlign w:val="subscript"/>
-              </w:rPr>
-              <w:t>2</w:t>
-            </w:r>
-            <w:r>
-              <w:rPr>
-                <w:rFonts w:ascii="Times New Roman" w:hAnsi="Times New Roman"/>
-                <w:b w:val="0"/>
-                <w:sz w:val="20"/>
-              </w:rPr>
-              <w:t xml:space="preserve"> H</w:t>
-            </w:r>
-            <w:r>
-              <w:rPr>
-                <w:rFonts w:ascii="Times New Roman" w:hAnsi="Times New Roman"/>
-                <w:b w:val="0"/>
-                <w:sz w:val="20"/>
-                <w:vertAlign w:val="subscript"/>
-              </w:rPr>
-              <w:t>4</w:t>
-            </w:r>
-            <w:r>
-              <w:rPr>
-                <w:rFonts w:ascii="Times New Roman" w:hAnsi="Times New Roman"/>
-                <w:b w:val="0"/>
-                <w:sz w:val="20"/>
-              </w:rPr>
-              <w:t xml:space="preserve"> O</w:t>
-            </w:r>
-            <w:r>
-              <w:rPr>
-                <w:rFonts w:ascii="Times New Roman" w:hAnsi="Times New Roman"/>
-                <w:b w:val="0"/>
-                <w:sz w:val="20"/>
-                <w:vertAlign w:val="subscript"/>
-              </w:rPr>
-              <w:t>2</w:t>
-            </w:r>
-          </w:p>
-        </w:tc>
-      </w:tr>
-      <w:tr>
-        <w:trPr>
-          <w:cantSplit/>
-        </w:trPr>
-        <w:tc>
-          <w:tcPr>
-            <w:tcW w:type="dxa" w:w="4083"/>
-            <w:vAlign w:val="center"/>
-          </w:tcPr>
-          <w:p>
-            <w:pPr>
-              <w:keepNext w:val="0"/>
-              <w:spacing w:after="20" w:before="0" w:line="240" w:lineRule="auto"/>
-              <w:ind w:left="0" w:right="0" w:firstLine="0"/>
-              <w:jc w:val="center"/>
-            </w:pPr>
-            <w:r>
-              <w:rPr>
-                <w:rFonts w:ascii="Times New Roman" w:hAnsi="Times New Roman"/>
-                <w:b w:val="0"/>
-                <w:sz w:val="20"/>
-              </w:rPr>
-              <w:t>Formula weight</w:t>
-            </w:r>
-          </w:p>
-        </w:tc>
-        <w:tc>
-          <w:tcPr>
-            <w:tcW w:type="dxa" w:w="3621"/>
-            <w:vAlign w:val="center"/>
-          </w:tcPr>
-          <w:p>
-            <w:pPr>
-              <w:keepNext w:val="0"/>
-              <w:spacing w:after="20" w:before="0" w:line="240" w:lineRule="auto"/>
-              <w:ind w:left="0" w:right="0" w:firstLine="0"/>
-              <w:jc w:val="center"/>
-            </w:pPr>
-            <w:r>
-              <w:rPr>
-                <w:rFonts w:ascii="Times New Roman" w:hAnsi="Times New Roman"/>
-                <w:b w:val="0"/>
-                <w:sz w:val="20"/>
-              </w:rPr>
-              <w:t>60.05</w:t>
-            </w:r>
-          </w:p>
-        </w:tc>
-      </w:tr>
-      <w:tr>
-        <w:trPr>
-          <w:cantSplit/>
-        </w:trPr>
-        <w:tc>
-          <w:tcPr>
-            <w:tcW w:type="dxa" w:w="4083"/>
-            <w:vAlign w:val="center"/>
-          </w:tcPr>
-          <w:p>
-            <w:pPr>
-              <w:keepNext w:val="0"/>
-              <w:spacing w:after="20" w:before="0" w:line="240" w:lineRule="auto"/>
-              <w:ind w:left="0" w:right="0" w:firstLine="0"/>
-              <w:jc w:val="center"/>
-            </w:pPr>
-            <w:r>
-              <w:rPr>
-                <w:rFonts w:ascii="Times New Roman" w:hAnsi="Times New Roman"/>
-                <w:b w:val="0"/>
-                <w:sz w:val="20"/>
-              </w:rPr>
-              <w:t>Temperature / K</w:t>
-            </w:r>
-          </w:p>
-        </w:tc>
-        <w:tc>
-          <w:tcPr>
-            <w:tcW w:type="dxa" w:w="3621"/>
-            <w:vAlign w:val="center"/>
-          </w:tcPr>
-          <w:p>
-            <w:pPr>
-              <w:keepNext w:val="0"/>
-              <w:spacing w:after="20" w:before="0" w:line="240" w:lineRule="auto"/>
-              <w:ind w:left="0" w:right="0" w:firstLine="0"/>
-              <w:jc w:val="center"/>
-            </w:pPr>
-            <w:r>
-              <w:rPr>
-                <w:rFonts w:ascii="Times New Roman" w:hAnsi="Times New Roman"/>
-                <w:b w:val="0"/>
-                <w:sz w:val="20"/>
-              </w:rPr>
-              <w:t>100(2)</w:t>
-            </w:r>
-          </w:p>
-        </w:tc>
-      </w:tr>
-      <w:tr>
-        <w:trPr>
-          <w:cantSplit/>
-        </w:trPr>
-        <w:tc>
-          <w:tcPr>
-            <w:tcW w:type="dxa" w:w="4083"/>
-            <w:vAlign w:val="center"/>
-          </w:tcPr>
-          <w:p>
-            <w:pPr>
-              <w:keepNext w:val="0"/>
-              <w:spacing w:after="20" w:before="0" w:line="240" w:lineRule="auto"/>
-              <w:ind w:left="0" w:right="0" w:firstLine="0"/>
-              <w:jc w:val="center"/>
-            </w:pPr>
-            <w:r>
-              <w:rPr>
-                <w:rFonts w:ascii="Times New Roman" w:hAnsi="Times New Roman"/>
-                <w:b w:val="0"/>
-                <w:sz w:val="20"/>
-              </w:rPr>
-              <w:t>Crystal system</w:t>
-            </w:r>
-          </w:p>
-        </w:tc>
-        <w:tc>
-          <w:tcPr>
-            <w:tcW w:type="dxa" w:w="3621"/>
-            <w:vAlign w:val="center"/>
-          </w:tcPr>
-          <w:p>
-            <w:pPr>
-              <w:keepNext w:val="0"/>
-              <w:spacing w:after="20" w:before="0" w:line="240" w:lineRule="auto"/>
-              <w:ind w:left="0" w:right="0" w:firstLine="0"/>
-              <w:jc w:val="center"/>
-            </w:pPr>
-            <w:r>
-              <w:rPr>
-                <w:rFonts w:ascii="Times New Roman" w:hAnsi="Times New Roman"/>
-                <w:b w:val="0"/>
-                <w:sz w:val="20"/>
-              </w:rPr>
-              <w:t>monoclinic</w:t>
-            </w:r>
-          </w:p>
-        </w:tc>
-      </w:tr>
-      <w:tr>
-        <w:trPr>
-          <w:cantSplit/>
-        </w:trPr>
-        <w:tc>
-          <w:tcPr>
-            <w:tcW w:type="dxa" w:w="4083"/>
-            <w:vAlign w:val="center"/>
-          </w:tcPr>
-          <w:p>
-            <w:pPr>
-              <w:keepNext w:val="0"/>
-              <w:spacing w:after="20" w:before="0" w:line="240" w:lineRule="auto"/>
-              <w:ind w:left="0" w:right="0" w:firstLine="0"/>
-              <w:jc w:val="center"/>
-            </w:pPr>
-            <w:r>
-              <w:rPr>
-                <w:rFonts w:ascii="Times New Roman" w:hAnsi="Times New Roman"/>
-                <w:b w:val="0"/>
-                <w:sz w:val="20"/>
-              </w:rPr>
-              <w:t>Space group</w:t>
-            </w:r>
-          </w:p>
-        </w:tc>
-        <w:tc>
-          <w:tcPr>
-            <w:tcW w:type="dxa" w:w="3621"/>
-            <w:vAlign w:val="center"/>
-          </w:tcPr>
-          <w:p>
-            <w:pPr>
-              <w:keepNext w:val="0"/>
-              <w:spacing w:after="20" w:before="0" w:line="240" w:lineRule="auto"/>
-              <w:ind w:left="0" w:right="0" w:firstLine="0"/>
-              <w:jc w:val="center"/>
-            </w:pPr>
-            <w:r>
-              <w:rPr>
-                <w:rFonts w:ascii="Times New Roman" w:hAnsi="Times New Roman"/>
-                <w:b w:val="0"/>
-                <w:sz w:val="20"/>
-              </w:rPr>
-              <w:t>P 21/c</w:t>
-            </w:r>
-          </w:p>
-        </w:tc>
-      </w:tr>
-      <w:tr>
-        <w:trPr>
-          <w:cantSplit/>
-        </w:trPr>
-        <w:tc>
-          <w:tcPr>
-            <w:tcW w:type="dxa" w:w="4083"/>
-            <w:vAlign w:val="center"/>
-          </w:tcPr>
-          <w:p>
-            <w:pPr>
-              <w:keepNext w:val="0"/>
-              <w:spacing w:after="20" w:before="0" w:line="240" w:lineRule="auto"/>
-              <w:ind w:left="0" w:right="0" w:firstLine="0"/>
-              <w:jc w:val="center"/>
-            </w:pPr>
-            <w:r>
-              <w:rPr>
-                <w:rFonts w:ascii="Times New Roman" w:hAnsi="Times New Roman"/>
-                <w:b w:val="0"/>
-                <w:sz w:val="20"/>
-              </w:rPr>
-              <w:t>a / Å</w:t>
-            </w:r>
-          </w:p>
-        </w:tc>
-        <w:tc>
-          <w:tcPr>
-            <w:tcW w:type="dxa" w:w="3621"/>
-            <w:vAlign w:val="center"/>
-          </w:tcPr>
-          <w:p>
-            <w:pPr>
-              <w:keepNext w:val="0"/>
-              <w:spacing w:after="20" w:before="0" w:line="240" w:lineRule="auto"/>
-              <w:ind w:left="0" w:right="0" w:firstLine="0"/>
-              <w:jc w:val="center"/>
-            </w:pPr>
-            <w:r>
-              <w:rPr>
-                <w:rFonts w:ascii="Times New Roman" w:hAnsi="Times New Roman"/>
-                <w:b w:val="0"/>
-                <w:sz w:val="20"/>
-              </w:rPr>
-              <w:t>5.000(2)</w:t>
-            </w:r>
-          </w:p>
-        </w:tc>
-      </w:tr>
-      <w:tr>
-        <w:trPr>
-          <w:cantSplit/>
-        </w:trPr>
-        <w:tc>
-          <w:tcPr>
-            <w:tcW w:type="dxa" w:w="4083"/>
-            <w:vAlign w:val="center"/>
-          </w:tcPr>
-          <w:p>
-            <w:pPr>
-              <w:keepNext w:val="0"/>
-              <w:spacing w:after="20" w:before="0" w:line="240" w:lineRule="auto"/>
-              <w:ind w:left="0" w:right="0" w:firstLine="0"/>
-              <w:jc w:val="center"/>
-            </w:pPr>
-            <w:r>
-              <w:rPr>
-                <w:rFonts w:ascii="Times New Roman" w:hAnsi="Times New Roman"/>
-                <w:b w:val="0"/>
-                <w:sz w:val="20"/>
-              </w:rPr>
-              <w:t>b / Å</w:t>
-            </w:r>
-          </w:p>
-        </w:tc>
-        <w:tc>
-          <w:tcPr>
-            <w:tcW w:type="dxa" w:w="3621"/>
-            <w:vAlign w:val="center"/>
-          </w:tcPr>
-          <w:p>
-            <w:pPr>
-              <w:keepNext w:val="0"/>
-              <w:spacing w:after="20" w:before="0" w:line="240" w:lineRule="auto"/>
-              <w:ind w:left="0" w:right="0" w:firstLine="0"/>
-              <w:jc w:val="center"/>
-            </w:pPr>
-            <w:r>
-              <w:rPr>
-                <w:rFonts w:ascii="Times New Roman" w:hAnsi="Times New Roman"/>
-                <w:b w:val="0"/>
-                <w:sz w:val="20"/>
-              </w:rPr>
-              <w:t>6.000(2)</w:t>
-            </w:r>
-          </w:p>
-        </w:tc>
-      </w:tr>
-      <w:tr>
-        <w:trPr>
-          <w:cantSplit/>
-        </w:trPr>
-        <w:tc>
-          <w:tcPr>
-            <w:tcW w:type="dxa" w:w="4083"/>
-            <w:vAlign w:val="center"/>
-          </w:tcPr>
-          <w:p>
-            <w:pPr>
-              <w:keepNext w:val="0"/>
-              <w:spacing w:after="20" w:before="0" w:line="240" w:lineRule="auto"/>
-              <w:ind w:left="0" w:right="0" w:firstLine="0"/>
-              <w:jc w:val="center"/>
-            </w:pPr>
-            <w:r>
-              <w:rPr>
-                <w:rFonts w:ascii="Times New Roman" w:hAnsi="Times New Roman"/>
-                <w:b w:val="0"/>
-                <w:sz w:val="20"/>
-              </w:rPr>
-              <w:t>c / Å</w:t>
-            </w:r>
-          </w:p>
-        </w:tc>
-        <w:tc>
-          <w:tcPr>
-            <w:tcW w:type="dxa" w:w="3621"/>
-            <w:vAlign w:val="center"/>
-          </w:tcPr>
-          <w:p>
-            <w:pPr>
-              <w:keepNext w:val="0"/>
-              <w:spacing w:after="20" w:before="0" w:line="240" w:lineRule="auto"/>
-              <w:ind w:left="0" w:right="0" w:firstLine="0"/>
-              <w:jc w:val="center"/>
-            </w:pPr>
-            <w:r>
-              <w:rPr>
-                <w:rFonts w:ascii="Times New Roman" w:hAnsi="Times New Roman"/>
-                <w:b w:val="0"/>
-                <w:sz w:val="20"/>
-              </w:rPr>
-              <w:t>7.000(2)</w:t>
-            </w:r>
-          </w:p>
-        </w:tc>
-      </w:tr>
-      <w:tr>
-        <w:trPr>
-          <w:cantSplit/>
-        </w:trPr>
-        <w:tc>
-          <w:tcPr>
-            <w:tcW w:type="dxa" w:w="4083"/>
-            <w:vAlign w:val="center"/>
-          </w:tcPr>
-          <w:p>
-            <w:pPr>
-              <w:keepNext w:val="0"/>
-              <w:spacing w:after="20" w:before="0" w:line="240" w:lineRule="auto"/>
-              <w:ind w:left="0" w:right="0" w:firstLine="0"/>
-              <w:jc w:val="center"/>
-            </w:pPr>
-            <w:r>
-              <w:rPr>
-                <w:rFonts w:ascii="Times New Roman" w:hAnsi="Times New Roman"/>
-                <w:b w:val="0"/>
-                <w:sz w:val="20"/>
-              </w:rPr>
-              <w:t>α / °</w:t>
-            </w:r>
-          </w:p>
-        </w:tc>
-        <w:tc>
-          <w:tcPr>
-            <w:tcW w:type="dxa" w:w="3621"/>
-            <w:vAlign w:val="center"/>
-          </w:tcPr>
-          <w:p>
-            <w:pPr>
-              <w:keepNext w:val="0"/>
-              <w:spacing w:after="20" w:before="0" w:line="240" w:lineRule="auto"/>
-              <w:ind w:left="0" w:right="0" w:firstLine="0"/>
-              <w:jc w:val="center"/>
-            </w:pPr>
-            <w:r>
-              <w:rPr>
-                <w:rFonts w:ascii="Times New Roman" w:hAnsi="Times New Roman"/>
-                <w:b w:val="0"/>
-                <w:sz w:val="20"/>
-              </w:rPr>
-              <w:t>90</w:t>
-            </w:r>
-          </w:p>
-        </w:tc>
-      </w:tr>
-      <w:tr>
-        <w:trPr>
-          <w:cantSplit/>
-        </w:trPr>
-        <w:tc>
-          <w:tcPr>
-            <w:tcW w:type="dxa" w:w="4083"/>
-            <w:vAlign w:val="center"/>
-          </w:tcPr>
-          <w:p>
-            <w:pPr>
-              <w:keepNext w:val="0"/>
-              <w:spacing w:after="20" w:before="0" w:line="240" w:lineRule="auto"/>
-              <w:ind w:left="0" w:right="0" w:firstLine="0"/>
-              <w:jc w:val="center"/>
-            </w:pPr>
-            <w:r>
-              <w:rPr>
-                <w:rFonts w:ascii="Times New Roman" w:hAnsi="Times New Roman"/>
-                <w:b w:val="0"/>
-                <w:sz w:val="20"/>
-              </w:rPr>
-              <w:t>β / °</w:t>
-            </w:r>
-          </w:p>
-        </w:tc>
-        <w:tc>
-          <w:tcPr>
-            <w:tcW w:type="dxa" w:w="3621"/>
-            <w:vAlign w:val="center"/>
-          </w:tcPr>
-          <w:p>
-            <w:pPr>
-              <w:keepNext w:val="0"/>
-              <w:spacing w:after="20" w:before="0" w:line="240" w:lineRule="auto"/>
-              <w:ind w:left="0" w:right="0" w:firstLine="0"/>
-              <w:jc w:val="center"/>
-            </w:pPr>
-            <w:r>
-              <w:rPr>
-                <w:rFonts w:ascii="Times New Roman" w:hAnsi="Times New Roman"/>
-                <w:b w:val="0"/>
-                <w:sz w:val="20"/>
-              </w:rPr>
-              <w:t>100.000(3)</w:t>
-            </w:r>
-          </w:p>
-        </w:tc>
-      </w:tr>
-      <w:tr>
-        <w:trPr>
-          <w:cantSplit/>
-        </w:trPr>
-        <w:tc>
-          <w:tcPr>
-            <w:tcW w:type="dxa" w:w="4083"/>
-            <w:vAlign w:val="center"/>
-          </w:tcPr>
-          <w:p>
-            <w:pPr>
-              <w:keepNext w:val="0"/>
-              <w:spacing w:after="20" w:before="0" w:line="240" w:lineRule="auto"/>
-              <w:ind w:left="0" w:right="0" w:firstLine="0"/>
-              <w:jc w:val="center"/>
-            </w:pPr>
-            <w:r>
-              <w:rPr>
-                <w:rFonts w:ascii="Times New Roman" w:hAnsi="Times New Roman"/>
-                <w:b w:val="0"/>
-                <w:sz w:val="20"/>
-              </w:rPr>
-              <w:t>γ / °</w:t>
-            </w:r>
-          </w:p>
-        </w:tc>
-        <w:tc>
-          <w:tcPr>
-            <w:tcW w:type="dxa" w:w="3621"/>
-            <w:vAlign w:val="center"/>
-          </w:tcPr>
-          <w:p>
-            <w:pPr>
-              <w:keepNext w:val="0"/>
-              <w:spacing w:after="20" w:before="0" w:line="240" w:lineRule="auto"/>
-              <w:ind w:left="0" w:right="0" w:firstLine="0"/>
-              <w:jc w:val="center"/>
-            </w:pPr>
-            <w:r>
-              <w:rPr>
-                <w:rFonts w:ascii="Times New Roman" w:hAnsi="Times New Roman"/>
-                <w:b w:val="0"/>
-                <w:sz w:val="20"/>
-              </w:rPr>
-              <w:t>90</w:t>
-            </w:r>
-          </w:p>
-        </w:tc>
-      </w:tr>
-      <w:tr>
-        <w:trPr>
-          <w:cantSplit/>
-        </w:trPr>
-        <w:tc>
-          <w:tcPr>
-            <w:tcW w:type="dxa" w:w="4083"/>
-            <w:vAlign w:val="center"/>
-          </w:tcPr>
-          <w:p>
-            <w:pPr>
-              <w:keepNext w:val="0"/>
-              <w:spacing w:after="20" w:before="0" w:line="240" w:lineRule="auto"/>
-              <w:ind w:left="0" w:right="0" w:firstLine="0"/>
-              <w:jc w:val="center"/>
-            </w:pPr>
-            <w:r>
-              <w:rPr>
-                <w:rFonts w:ascii="Times New Roman" w:hAnsi="Times New Roman"/>
-                <w:b w:val="0"/>
-                <w:sz w:val="20"/>
-              </w:rPr>
-              <w:t>V / Å³</w:t>
-            </w:r>
-          </w:p>
-        </w:tc>
-        <w:tc>
-          <w:tcPr>
-            <w:tcW w:type="dxa" w:w="3621"/>
-            <w:vAlign w:val="center"/>
-          </w:tcPr>
-          <w:p>
-            <w:pPr>
-              <w:keepNext w:val="0"/>
-              <w:spacing w:after="20" w:before="0" w:line="240" w:lineRule="auto"/>
-              <w:ind w:left="0" w:right="0" w:firstLine="0"/>
-              <w:jc w:val="center"/>
-            </w:pPr>
-            <w:r>
-              <w:rPr>
-                <w:rFonts w:ascii="Times New Roman" w:hAnsi="Times New Roman"/>
-                <w:b w:val="0"/>
-                <w:sz w:val="20"/>
-              </w:rPr>
-              <w:t>206.81(12)</w:t>
-            </w:r>
-          </w:p>
-        </w:tc>
-      </w:tr>
-      <w:tr>
-        <w:trPr>
-          <w:cantSplit/>
-        </w:trPr>
-        <w:tc>
-          <w:tcPr>
-            <w:tcW w:type="dxa" w:w="4083"/>
-            <w:vAlign w:val="center"/>
-          </w:tcPr>
-          <w:p>
-            <w:pPr>
-              <w:keepNext w:val="0"/>
-              <w:spacing w:after="20" w:before="0" w:line="240" w:lineRule="auto"/>
-              <w:ind w:left="0" w:right="0" w:firstLine="0"/>
-              <w:jc w:val="center"/>
-            </w:pPr>
-            <w:r>
-              <w:rPr>
-                <w:rFonts w:ascii="Times New Roman" w:hAnsi="Times New Roman"/>
-                <w:b w:val="0"/>
-                <w:sz w:val="20"/>
-              </w:rPr>
-              <w:t>Z</w:t>
-            </w:r>
-          </w:p>
-        </w:tc>
-        <w:tc>
-          <w:tcPr>
-            <w:tcW w:type="dxa" w:w="3621"/>
-            <w:vAlign w:val="center"/>
-          </w:tcPr>
-          <w:p>
-            <w:pPr>
-              <w:keepNext w:val="0"/>
-              <w:spacing w:after="20" w:before="0" w:line="240" w:lineRule="auto"/>
-              <w:ind w:left="0" w:right="0" w:firstLine="0"/>
-              <w:jc w:val="center"/>
-            </w:pPr>
-            <w:r>
-              <w:rPr>
-                <w:rFonts w:ascii="Times New Roman" w:hAnsi="Times New Roman"/>
-                <w:b w:val="0"/>
-                <w:sz w:val="20"/>
-              </w:rPr>
-              <w:t>2</w:t>
-            </w:r>
-          </w:p>
-        </w:tc>
-      </w:tr>
-      <w:tr>
-        <w:trPr>
-          <w:cantSplit/>
-        </w:trPr>
-        <w:tc>
-          <w:tcPr>
-            <w:tcW w:type="dxa" w:w="4083"/>
-            <w:vAlign w:val="center"/>
-          </w:tcPr>
-          <w:p>
-            <w:pPr>
-              <w:keepNext w:val="0"/>
-              <w:spacing w:after="20" w:before="0" w:line="240" w:lineRule="auto"/>
-              <w:ind w:left="0" w:right="0" w:firstLine="0"/>
-              <w:jc w:val="center"/>
-            </w:pPr>
-            <w:r>
-              <w:rPr>
-                <w:rFonts w:ascii="Times New Roman" w:hAnsi="Times New Roman"/>
-                <w:b w:val="0"/>
-                <w:sz w:val="20"/>
-              </w:rPr>
-              <w:t>Calculated density / Mg m⁻³</w:t>
-            </w:r>
-          </w:p>
-        </w:tc>
-        <w:tc>
-          <w:tcPr>
-            <w:tcW w:type="dxa" w:w="3621"/>
-            <w:vAlign w:val="center"/>
-          </w:tcPr>
-          <w:p>
-            <w:pPr>
-              <w:keepNext w:val="0"/>
-              <w:spacing w:after="20" w:before="0" w:line="240" w:lineRule="auto"/>
-              <w:ind w:left="0" w:right="0" w:firstLine="0"/>
-              <w:jc w:val="center"/>
-            </w:pPr>
-            <w:r>
-              <w:rPr>
-                <w:rFonts w:ascii="Times New Roman" w:hAnsi="Times New Roman"/>
-                <w:b w:val="0"/>
-                <w:sz w:val="20"/>
-              </w:rPr>
-              <w:t>1.200</w:t>
-            </w:r>
-          </w:p>
-        </w:tc>
-      </w:tr>
-      <w:tr>
-        <w:trPr>
-          <w:cantSplit/>
-        </w:trPr>
-        <w:tc>
-          <w:tcPr>
-            <w:tcW w:type="dxa" w:w="4083"/>
-            <w:vAlign w:val="center"/>
-          </w:tcPr>
-          <w:p>
-            <w:pPr>
-              <w:keepNext w:val="0"/>
-              <w:spacing w:after="20" w:before="0" w:line="240" w:lineRule="auto"/>
-              <w:ind w:left="0" w:right="0" w:firstLine="0"/>
-              <w:jc w:val="center"/>
-            </w:pPr>
-            <w:r>
-              <w:rPr>
-                <w:rFonts w:ascii="Times New Roman" w:hAnsi="Times New Roman"/>
-                <w:b w:val="0"/>
-                <w:sz w:val="20"/>
-              </w:rPr>
-              <w:t>Absorption coefficient / mm⁻¹</w:t>
-            </w:r>
-          </w:p>
-        </w:tc>
-        <w:tc>
-          <w:tcPr>
-            <w:tcW w:type="dxa" w:w="3621"/>
-            <w:vAlign w:val="center"/>
-          </w:tcPr>
-          <w:p>
-            <w:pPr>
-              <w:keepNext w:val="0"/>
-              <w:spacing w:after="20" w:before="0" w:line="240" w:lineRule="auto"/>
-              <w:ind w:left="0" w:right="0" w:firstLine="0"/>
-              <w:jc w:val="center"/>
-            </w:pPr>
-            <w:r>
-              <w:rPr>
-                <w:rFonts w:ascii="Times New Roman" w:hAnsi="Times New Roman"/>
-                <w:b w:val="0"/>
-                <w:sz w:val="20"/>
-              </w:rPr>
-              <w:t>0.10</w:t>
-            </w:r>
-          </w:p>
-        </w:tc>
-      </w:tr>
-      <w:tr>
-        <w:trPr>
-          <w:cantSplit/>
-        </w:trPr>
-        <w:tc>
-          <w:tcPr>
-            <w:tcW w:type="dxa" w:w="4083"/>
-            <w:vAlign w:val="center"/>
-          </w:tcPr>
-          <w:p>
-            <w:pPr>
-              <w:keepNext w:val="0"/>
-              <w:spacing w:after="20" w:before="0" w:line="240" w:lineRule="auto"/>
-              <w:ind w:left="0" w:right="0" w:firstLine="0"/>
-              <w:jc w:val="center"/>
-            </w:pPr>
-            <w:r>
-              <w:rPr>
-                <w:rFonts w:ascii="Times New Roman" w:hAnsi="Times New Roman"/>
-                <w:b w:val="0"/>
-                <w:sz w:val="20"/>
-              </w:rPr>
-              <w:t>F(000)</w:t>
-            </w:r>
-          </w:p>
-        </w:tc>
-        <w:tc>
-          <w:tcPr>
-            <w:tcW w:type="dxa" w:w="3621"/>
-            <w:vAlign w:val="center"/>
-          </w:tcPr>
-          <w:p>
-            <w:pPr>
-              <w:keepNext w:val="0"/>
-              <w:spacing w:after="20" w:before="0" w:line="240" w:lineRule="auto"/>
-              <w:ind w:left="0" w:right="0" w:firstLine="0"/>
-              <w:jc w:val="center"/>
-            </w:pPr>
-            <w:r>
-              <w:rPr>
-                <w:rFonts w:ascii="Times New Roman" w:hAnsi="Times New Roman"/>
-                <w:b w:val="0"/>
-                <w:sz w:val="20"/>
-              </w:rPr>
-              <w:t>64</w:t>
-            </w:r>
-          </w:p>
-        </w:tc>
-      </w:tr>
-      <w:tr>
-        <w:trPr>
-          <w:cantSplit/>
-        </w:trPr>
-        <w:tc>
-          <w:tcPr>
-            <w:tcW w:type="dxa" w:w="4083"/>
-            <w:vAlign w:val="center"/>
-          </w:tcPr>
-          <w:p>
-            <w:pPr>
-              <w:keepNext w:val="0"/>
-              <w:spacing w:after="20" w:before="0" w:line="240" w:lineRule="auto"/>
-              <w:ind w:left="0" w:right="0" w:firstLine="0"/>
-              <w:jc w:val="center"/>
-            </w:pPr>
-            <w:r>
-              <w:rPr>
-                <w:rFonts w:ascii="Times New Roman" w:hAnsi="Times New Roman"/>
-                <w:b w:val="0"/>
-                <w:sz w:val="20"/>
-              </w:rPr>
-              <w:t>Crystal size / mm</w:t>
-            </w:r>
-          </w:p>
-        </w:tc>
-        <w:tc>
-          <w:tcPr>
-            <w:tcW w:type="dxa" w:w="3621"/>
-            <w:vAlign w:val="center"/>
-          </w:tcPr>
-          <w:p>
-            <w:pPr>
-              <w:keepNext w:val="0"/>
-              <w:spacing w:after="20" w:before="0" w:line="240" w:lineRule="auto"/>
-              <w:ind w:left="0" w:right="0" w:firstLine="0"/>
-              <w:jc w:val="center"/>
-            </w:pPr>
-            <w:r>
-              <w:rPr>
-                <w:rFonts w:ascii="Times New Roman" w:hAnsi="Times New Roman"/>
-                <w:b w:val="0"/>
-                <w:sz w:val="20"/>
-              </w:rPr>
-              <w:t>0.20 × 0.15 × 0.10</w:t>
-            </w:r>
-          </w:p>
-        </w:tc>
-      </w:tr>
-      <w:tr>
-        <w:trPr>
-          <w:cantSplit/>
-        </w:trPr>
-        <w:tc>
-          <w:tcPr>
-            <w:tcW w:type="dxa" w:w="4083"/>
-            <w:vAlign w:val="center"/>
-          </w:tcPr>
-          <w:p>
-            <w:pPr>
-              <w:keepNext w:val="0"/>
-              <w:spacing w:after="20" w:before="0" w:line="240" w:lineRule="auto"/>
-              <w:ind w:left="0" w:right="0" w:firstLine="0"/>
-              <w:jc w:val="center"/>
-            </w:pPr>
-            <w:r>
-              <w:rPr>
-                <w:rFonts w:ascii="Times New Roman" w:hAnsi="Times New Roman"/>
-                <w:b w:val="0"/>
-                <w:sz w:val="20"/>
-              </w:rPr>
-              <w:t>Radiation (wavelength / Å)</w:t>
-            </w:r>
-          </w:p>
-        </w:tc>
-        <w:tc>
-          <w:tcPr>
-            <w:tcW w:type="dxa" w:w="3621"/>
-            <w:vAlign w:val="center"/>
-          </w:tcPr>
-          <w:p>
-            <w:pPr>
-              <w:keepNext w:val="0"/>
-              <w:spacing w:after="20" w:before="0" w:line="240" w:lineRule="auto"/>
-              <w:ind w:left="0" w:right="0" w:firstLine="0"/>
-              <w:jc w:val="center"/>
-            </w:pPr>
-            <w:r>
-              <w:rPr>
-                <w:rFonts w:ascii="Times New Roman" w:hAnsi="Times New Roman"/>
-                <w:b w:val="0"/>
-                <w:sz w:val="20"/>
-              </w:rPr>
-              <w:t>MoKα (λ = 0.71073)</w:t>
-            </w:r>
-          </w:p>
-        </w:tc>
-      </w:tr>
-      <w:tr>
-        <w:trPr>
-          <w:cantSplit/>
-        </w:trPr>
-        <w:tc>
-          <w:tcPr>
-            <w:tcW w:type="dxa" w:w="4083"/>
-            <w:vAlign w:val="center"/>
-          </w:tcPr>
-          <w:p>
-            <w:pPr>
-              <w:keepNext w:val="0"/>
-              <w:spacing w:after="20" w:before="0" w:line="240" w:lineRule="auto"/>
-              <w:ind w:left="0" w:right="0" w:firstLine="0"/>
-              <w:jc w:val="center"/>
-            </w:pPr>
-            <w:r>
-              <w:rPr>
-                <w:rFonts w:ascii="Times New Roman" w:hAnsi="Times New Roman"/>
-                <w:b w:val="0"/>
-                <w:sz w:val="20"/>
-              </w:rPr>
-              <w:t>θ range for data collection / °</w:t>
-            </w:r>
-          </w:p>
-        </w:tc>
-        <w:tc>
-          <w:tcPr>
-            <w:tcW w:type="dxa" w:w="3621"/>
-            <w:vAlign w:val="center"/>
-          </w:tcPr>
-          <w:p>
-            <w:pPr>
-              <w:keepNext w:val="0"/>
-              <w:spacing w:after="20" w:before="0" w:line="240" w:lineRule="auto"/>
-              <w:ind w:left="0" w:right="0" w:firstLine="0"/>
-              <w:jc w:val="center"/>
-            </w:pPr>
-            <w:r>
-              <w:rPr>
-                <w:rFonts w:ascii="Times New Roman" w:hAnsi="Times New Roman"/>
-                <w:b w:val="0"/>
-                <w:sz w:val="20"/>
-              </w:rPr>
-              <w:t>2.0–30.0</w:t>
-            </w:r>
-          </w:p>
-        </w:tc>
-      </w:tr>
-      <w:tr>
-        <w:trPr>
-          <w:cantSplit/>
-        </w:trPr>
-        <w:tc>
-          <w:tcPr>
-            <w:tcW w:type="dxa" w:w="4083"/>
-            <w:vAlign w:val="center"/>
-          </w:tcPr>
-          <w:p>
-            <w:pPr>
-              <w:keepNext w:val="0"/>
-              <w:spacing w:after="20" w:before="0" w:line="240" w:lineRule="auto"/>
-              <w:ind w:left="0" w:right="0" w:firstLine="0"/>
-              <w:jc w:val="center"/>
-            </w:pPr>
-            <w:r>
-              <w:rPr>
-                <w:rFonts w:ascii="Times New Roman" w:hAnsi="Times New Roman"/>
-                <w:b w:val="0"/>
-                <w:sz w:val="20"/>
-              </w:rPr>
-              <w:t>Index ranges</w:t>
-            </w:r>
-          </w:p>
-        </w:tc>
-        <w:tc>
-          <w:tcPr>
-            <w:tcW w:type="dxa" w:w="3621"/>
-            <w:vAlign w:val="center"/>
-          </w:tcPr>
-          <w:p>
-            <w:pPr>
-              <w:keepNext w:val="0"/>
-              <w:spacing w:after="20" w:before="0" w:line="240" w:lineRule="auto"/>
-              <w:ind w:left="0" w:right="0" w:firstLine="0"/>
-              <w:jc w:val="center"/>
-            </w:pPr>
-            <w:r>
-              <w:rPr>
-                <w:rFonts w:ascii="Times New Roman" w:hAnsi="Times New Roman"/>
-                <w:b w:val="0"/>
-                <w:sz w:val="20"/>
-              </w:rPr>
-              <w:t>-6 ≤ h ≤ 6; -7 ≤ k ≤ 7; -8 ≤ l ≤ 8</w:t>
-            </w:r>
-          </w:p>
-        </w:tc>
-      </w:tr>
-      <w:tr>
-        <w:trPr>
-          <w:cantSplit/>
-        </w:trPr>
-        <w:tc>
-          <w:tcPr>
-            <w:tcW w:type="dxa" w:w="4083"/>
-            <w:vAlign w:val="center"/>
-          </w:tcPr>
-          <w:p>
-            <w:pPr>
-              <w:keepNext w:val="0"/>
-              <w:spacing w:after="20" w:before="0" w:line="240" w:lineRule="auto"/>
-              <w:ind w:left="0" w:right="0" w:firstLine="0"/>
-              <w:jc w:val="center"/>
-            </w:pPr>
-            <w:r>
-              <w:rPr>
-                <w:rFonts w:ascii="Times New Roman" w:hAnsi="Times New Roman"/>
-                <w:b w:val="0"/>
-                <w:sz w:val="20"/>
-              </w:rPr>
-              <w:t>Reflections collected / independent / observed</w:t>
-            </w:r>
-          </w:p>
-        </w:tc>
-        <w:tc>
-          <w:tcPr>
-            <w:tcW w:type="dxa" w:w="3621"/>
-            <w:vAlign w:val="center"/>
-          </w:tcPr>
-          <w:p>
-            <w:pPr>
-              <w:keepNext w:val="0"/>
-              <w:spacing w:after="20" w:before="0" w:line="240" w:lineRule="auto"/>
-              <w:ind w:left="0" w:right="0" w:firstLine="0"/>
-              <w:jc w:val="center"/>
-            </w:pPr>
-            <w:r>
-              <w:rPr>
-                <w:rFonts w:ascii="Times New Roman" w:hAnsi="Times New Roman"/>
-                <w:b w:val="0"/>
-                <w:sz w:val="20"/>
-              </w:rPr>
-              <w:t>1000 / 500 / 450</w:t>
-            </w:r>
-          </w:p>
-        </w:tc>
-      </w:tr>
-      <w:tr>
-        <w:trPr>
-          <w:cantSplit/>
-        </w:trPr>
-        <w:tc>
-          <w:tcPr>
-            <w:tcW w:type="dxa" w:w="4083"/>
-            <w:vAlign w:val="center"/>
-          </w:tcPr>
-          <w:p>
-            <w:pPr>
-              <w:keepNext w:val="0"/>
-              <w:spacing w:after="20" w:before="0" w:line="240" w:lineRule="auto"/>
-              <w:ind w:left="0" w:right="0" w:firstLine="0"/>
-              <w:jc w:val="center"/>
-            </w:pPr>
-            <w:r>
-              <w:rPr>
-                <w:rFonts w:ascii="Times New Roman" w:hAnsi="Times New Roman"/>
-                <w:b w:val="0"/>
-                <w:sz w:val="20"/>
-              </w:rPr>
-              <w:t>Rint</w:t>
-            </w:r>
-          </w:p>
-        </w:tc>
-        <w:tc>
-          <w:tcPr>
-            <w:tcW w:type="dxa" w:w="3621"/>
-            <w:vAlign w:val="center"/>
-          </w:tcPr>
-          <w:p>
-            <w:pPr>
-              <w:keepNext w:val="0"/>
-              <w:spacing w:after="20" w:before="0" w:line="240" w:lineRule="auto"/>
-              <w:ind w:left="0" w:right="0" w:firstLine="0"/>
-              <w:jc w:val="center"/>
-            </w:pPr>
-            <w:r>
-              <w:rPr>
-                <w:rFonts w:ascii="Times New Roman" w:hAnsi="Times New Roman"/>
-                <w:b w:val="0"/>
-                <w:sz w:val="20"/>
-              </w:rPr>
-              <w:t>0.030</w:t>
-            </w:r>
-          </w:p>
-        </w:tc>
-      </w:tr>
-      <w:tr>
-        <w:trPr>
-          <w:cantSplit/>
-        </w:trPr>
-        <w:tc>
-          <w:tcPr>
-            <w:tcW w:type="dxa" w:w="4083"/>
-            <w:vAlign w:val="center"/>
-          </w:tcPr>
-          <w:p>
-            <w:pPr>
-              <w:keepNext w:val="0"/>
-              <w:spacing w:after="20" w:before="0" w:line="240" w:lineRule="auto"/>
-              <w:ind w:left="0" w:right="0" w:firstLine="0"/>
-              <w:jc w:val="center"/>
-            </w:pPr>
-            <w:r>
-              <w:rPr>
-                <w:rFonts w:ascii="Times New Roman" w:hAnsi="Times New Roman"/>
-                <w:b w:val="0"/>
-                <w:sz w:val="20"/>
-              </w:rPr>
-              <w:t>Data / restraints / parameters</w:t>
-            </w:r>
-          </w:p>
-        </w:tc>
-        <w:tc>
-          <w:tcPr>
-            <w:tcW w:type="dxa" w:w="3621"/>
-            <w:vAlign w:val="center"/>
-          </w:tcPr>
-          <w:p>
-            <w:pPr>
-              <w:keepNext w:val="0"/>
-              <w:spacing w:after="20" w:before="0" w:line="240" w:lineRule="auto"/>
-              <w:ind w:left="0" w:right="0" w:firstLine="0"/>
-              <w:jc w:val="center"/>
-            </w:pPr>
-            <w:r>
-              <w:rPr>
-                <w:rFonts w:ascii="Times New Roman" w:hAnsi="Times New Roman"/>
-                <w:b w:val="0"/>
-                <w:sz w:val="20"/>
-              </w:rPr>
-              <w:t>500 / 0 / 40</w:t>
-            </w:r>
-          </w:p>
-        </w:tc>
-      </w:tr>
-      <w:tr>
-        <w:trPr>
-          <w:cantSplit/>
-        </w:trPr>
-        <w:tc>
-          <w:tcPr>
-            <w:tcW w:type="dxa" w:w="4083"/>
-            <w:vAlign w:val="center"/>
-          </w:tcPr>
-          <w:p>
-            <w:pPr>
-              <w:keepNext w:val="0"/>
-              <w:spacing w:after="20" w:before="0" w:line="240" w:lineRule="auto"/>
-              <w:ind w:left="0" w:right="0" w:firstLine="0"/>
-              <w:jc w:val="center"/>
-            </w:pPr>
-            <w:r>
-              <w:rPr>
-                <w:rFonts w:ascii="Times New Roman" w:hAnsi="Times New Roman"/>
-                <w:b w:val="0"/>
-                <w:sz w:val="20"/>
-              </w:rPr>
-              <w:t>Goodness-of-fit on F²</w:t>
-            </w:r>
-          </w:p>
-        </w:tc>
-        <w:tc>
-          <w:tcPr>
-            <w:tcW w:type="dxa" w:w="3621"/>
-            <w:vAlign w:val="center"/>
-          </w:tcPr>
-          <w:p>
-            <w:pPr>
-              <w:keepNext w:val="0"/>
-              <w:spacing w:after="20" w:before="0" w:line="240" w:lineRule="auto"/>
-              <w:ind w:left="0" w:right="0" w:firstLine="0"/>
-              <w:jc w:val="center"/>
-            </w:pPr>
-            <w:r>
-              <w:rPr>
-                <w:rFonts w:ascii="Times New Roman" w:hAnsi="Times New Roman"/>
-                <w:b w:val="0"/>
-                <w:sz w:val="20"/>
-              </w:rPr>
-              <w:t>1.02</w:t>
-            </w:r>
-          </w:p>
-        </w:tc>
-      </w:tr>
-      <w:tr>
-        <w:trPr>
-          <w:cantSplit/>
-        </w:trPr>
-        <w:tc>
-          <w:tcPr>
-            <w:tcW w:type="dxa" w:w="4083"/>
-            <w:vAlign w:val="center"/>
-          </w:tcPr>
-          <w:p>
-            <w:pPr>
-              <w:keepNext w:val="0"/>
-              <w:spacing w:after="20" w:before="0" w:line="240" w:lineRule="auto"/>
-              <w:ind w:left="0" w:right="0" w:firstLine="0"/>
-              <w:jc w:val="center"/>
-            </w:pPr>
-            <w:r>
-              <w:rPr>
-                <w:rFonts w:ascii="Times New Roman" w:hAnsi="Times New Roman"/>
-                <w:b w:val="0"/>
-                <w:sz w:val="20"/>
-              </w:rPr>
-              <w:t>Final R indices (observed data)</w:t>
-            </w:r>
-          </w:p>
-        </w:tc>
-        <w:tc>
-          <w:tcPr>
-            <w:tcW w:type="dxa" w:w="3621"/>
-            <w:vAlign w:val="center"/>
-          </w:tcPr>
-          <w:p>
-            <w:pPr>
-              <w:keepNext w:val="0"/>
-              <w:spacing w:after="20" w:before="0" w:line="240" w:lineRule="auto"/>
-              <w:ind w:left="0" w:right="0" w:firstLine="0"/>
-              <w:jc w:val="center"/>
-            </w:pPr>
-            <w:r>
-              <w:rPr>
-                <w:rFonts w:ascii="Times New Roman" w:hAnsi="Times New Roman"/>
-                <w:b w:val="0"/>
-                <w:sz w:val="20"/>
-              </w:rPr>
-              <w:t>R1 = 0.035, wR2 = 0.090</w:t>
-            </w:r>
-          </w:p>
-        </w:tc>
-      </w:tr>
-      <w:tr>
-        <w:trPr>
-          <w:cantSplit/>
-        </w:trPr>
-        <w:tc>
-          <w:tcPr>
-            <w:tcW w:type="dxa" w:w="4083"/>
-            <w:vAlign w:val="center"/>
-          </w:tcPr>
-          <w:p>
-            <w:pPr>
-              <w:keepNext w:val="0"/>
-              <w:spacing w:after="20" w:before="0" w:line="240" w:lineRule="auto"/>
-              <w:ind w:left="0" w:right="0" w:firstLine="0"/>
-              <w:jc w:val="center"/>
-            </w:pPr>
-            <w:r>
-              <w:rPr>
-                <w:rFonts w:ascii="Times New Roman" w:hAnsi="Times New Roman"/>
-                <w:b w:val="0"/>
-                <w:sz w:val="20"/>
-              </w:rPr>
-              <w:t>R indices (all data)</w:t>
-            </w:r>
-          </w:p>
-        </w:tc>
-        <w:tc>
-          <w:tcPr>
-            <w:tcW w:type="dxa" w:w="3621"/>
-            <w:vAlign w:val="center"/>
-          </w:tcPr>
-          <w:p>
-            <w:pPr>
-              <w:keepNext w:val="0"/>
-              <w:spacing w:after="20" w:before="0" w:line="240" w:lineRule="auto"/>
-              <w:ind w:left="0" w:right="0" w:firstLine="0"/>
-              <w:jc w:val="center"/>
-            </w:pPr>
-            <w:r>
-              <w:rPr>
-                <w:rFonts w:ascii="Times New Roman" w:hAnsi="Times New Roman"/>
-                <w:b w:val="0"/>
-                <w:sz w:val="20"/>
-              </w:rPr>
-              <w:t>R1 = 0.040, wR2 = 0.095</w:t>
-            </w:r>
-          </w:p>
-        </w:tc>
-      </w:tr>
-      <w:tr>
-        <w:trPr>
-          <w:cantSplit/>
-        </w:trPr>
-        <w:tc>
-          <w:tcPr>
-            <w:tcW w:type="dxa" w:w="4083"/>
-            <w:vAlign w:val="center"/>
-          </w:tcPr>
-          <w:p>
-            <w:pPr>
-              <w:keepNext w:val="0"/>
-              <w:spacing w:after="20" w:before="0" w:line="240" w:lineRule="auto"/>
-              <w:ind w:left="0" w:right="0" w:firstLine="0"/>
-              <w:jc w:val="center"/>
-            </w:pPr>
-            <w:r>
-              <w:rPr>
-                <w:rFonts w:ascii="Times New Roman" w:hAnsi="Times New Roman"/>
-                <w:b w:val="0"/>
-                <w:sz w:val="20"/>
-              </w:rPr>
-              <w:t>Largest diff. peak and hole / e Å⁻³</w:t>
-            </w:r>
-          </w:p>
-        </w:tc>
-        <w:tc>
-          <w:tcPr>
-            <w:tcW w:type="dxa" w:w="3621"/>
-            <w:vAlign w:val="center"/>
-          </w:tcPr>
-          <w:p>
-            <w:pPr>
-              <w:keepNext w:val="0"/>
-              <w:spacing w:after="20" w:before="0" w:line="240" w:lineRule="auto"/>
-              <w:ind w:left="0" w:right="0" w:firstLine="0"/>
-              <w:jc w:val="center"/>
-            </w:pPr>
-            <w:r>
-              <w:rPr>
-                <w:rFonts w:ascii="Times New Roman" w:hAnsi="Times New Roman"/>
-                <w:b w:val="0"/>
-                <w:sz w:val="20"/>
-              </w:rPr>
-              <w:t>0.20 / -0.18</w:t>
-            </w:r>
-          </w:p>
-        </w:tc>
-      </w:tr>
-    </w:tbl>
-    <w:p/>
-    <w:p>
-      <w:bookmarkEnd w:id="958759905"/>
     </w:p>
     <w:p>
       <w:r>
@@ -3551,10 +1972,10 @@
             <o:lock v:ext="edit" aspectratio="t"/>
           </v:shapetype>
           <v:shape id="_x0000_i1025" type="#_x0000_t75" style="position:absolute;left:0;text-align:left;margin-left:0pt;margin-top:0pt;width:83.25pt;height:64.5pt;z-index:251659264" o:ole="" o:allowoverlap="t">
-            <v:imagedata r:id="rIdSI51" o:title=""/>
+            <v:imagedata r:id="rIdSI47" o:title=""/>
             <w10:wrap type="none"/>
           </v:shape>
-          <o:OLEObject Type="Embed" ProgID="ChemDraw.Document" ShapeID="_x0000_i1025" DrawAspect="Content" ObjectID="_1851838593" r:id="rIdSI52"/>
+          <o:OLEObject Type="Embed" ProgID="ChemDraw.Document" ShapeID="_x0000_i1025" DrawAspect="Content" ObjectID="_1851838593" r:id="rIdSI48"/>
         </w:object>
       </w:r>
     </w:p>
@@ -3566,7 +1987,7 @@
         <w:drawing>
           <ns1:inline>
             <ns1:extent cx="5972810" cy="4167444"/>
-            <ns1:docPr id="2" name="Picture 2"/>
+            <ns1:docPr id="1" name="Picture 1"/>
             <ns1:cNvGraphicFramePr>
               <ns2:graphicFrameLocks noChangeAspect="1"/>
             </ns1:cNvGraphicFramePr>
@@ -3578,7 +1999,7 @@
                     <ns3:cNvPicPr/>
                   </ns3:nvPicPr>
                   <ns3:blipFill>
-                    <ns2:blip r:embed="rId35"/>
+                    <ns2:blip r:embed="rId34"/>
                     <ns2:stretch>
                       <ns2:fillRect/>
                     </ns2:stretch>
@@ -3721,10 +2142,161 @@
             <o:lock v:ext="edit" aspectratio="t"/>
           </v:shapetype>
           <v:shape id="_x0000_i1025" type="#_x0000_t75" style="position:absolute;left:0;text-align:left;margin-left:0pt;margin-top:0pt;width:83.25pt;height:64.5pt;z-index:251659264" o:ole="" o:allowoverlap="t">
-            <v:imagedata r:id="rIdSI49" o:title=""/>
+            <v:imagedata r:id="rIdSI45" o:title=""/>
             <w10:wrap type="none"/>
           </v:shape>
-          <o:OLEObject Type="Embed" ProgID="ChemDraw.Document" ShapeID="_x0000_i1025" DrawAspect="Content" ObjectID="_1851838593" r:id="rIdSI50"/>
+          <o:OLEObject Type="Embed" ProgID="ChemDraw.Document" ShapeID="_x0000_i1025" DrawAspect="Content" ObjectID="_1851838593" r:id="rIdSI46"/>
+        </w:object>
+      </w:r>
+    </w:p>
+    <w:p>
+      <w:pPr>
+        <w:spacing w:before="0" w:after="0"/>
+      </w:pPr>
+      <w:r>
+        <w:drawing>
+          <ns1:inline>
+            <ns1:extent cx="5972810" cy="4167444"/>
+            <ns1:docPr id="2" name="Picture 2"/>
+            <ns1:cNvGraphicFramePr>
+              <ns2:graphicFrameLocks noChangeAspect="1"/>
+            </ns1:cNvGraphicFramePr>
+            <ns2:graphic>
+              <ns2:graphicData uri="http://schemas.openxmlformats.org/drawingml/2006/picture">
+                <ns3:pic>
+                  <ns3:nvPicPr>
+                    <ns3:cNvPr id="0" name="2a_13C.png"/>
+                    <ns3:cNvPicPr/>
+                  </ns3:nvPicPr>
+                  <ns3:blipFill>
+                    <ns2:blip r:embed="rId35"/>
+                    <ns2:stretch>
+                      <ns2:fillRect/>
+                    </ns2:stretch>
+                  </ns3:blipFill>
+                  <ns3:spPr>
+                    <ns2:xfrm>
+                      <ns2:off x="0" y="0"/>
+                      <ns2:ext cx="5972810" cy="4167444"/>
+                    </ns2:xfrm>
+                    <ns2:prstGeom prst="rect"/>
+                  </ns3:spPr>
+                </ns3:pic>
+              </ns2:graphicData>
+            </ns2:graphic>
+          </ns1:inline>
+        </w:drawing>
+      </w:r>
+      <w:bookmarkEnd w:id="4078659376"/>
+    </w:p>
+    <w:p>
+      <w:r>
+        <w:br w:type="page"/>
+      </w:r>
+    </w:p>
+    <w:p>
+      <w:pPr>
+        <w:spacing w:after="0" w:line="240" w:lineRule="auto" w:before="0"/>
+      </w:pPr>
+      <w:bookmarkStart w:id="3299855004" w:name="asig_spectrum_cmp_002_1H_9f900130"/>
+      <w:r>
+        <w:rPr>
+          <w:b/>
+        </w:rPr>
+        <w:t>Methyl (</w:t>
+      </w:r>
+      <w:r>
+        <w:rPr>
+          <w:b/>
+          <w:i/>
+        </w:rPr>
+        <w:t>E</w:t>
+      </w:r>
+      <w:r>
+        <w:rPr>
+          <w:b/>
+        </w:rPr>
+        <w:t>)-3-(2-(bromomethyl)-4-fluorophenyl)acrylate</w:t>
+      </w:r>
+      <w:r>
+        <w:rPr>
+          <w:b/>
+        </w:rPr>
+        <w:t xml:space="preserve"> (</w:t>
+      </w:r>
+      <w:r>
+        <w:rPr>
+          <w:b/>
+        </w:rPr>
+        <w:t>2b</w:t>
+      </w:r>
+      <w:r>
+        <w:rPr>
+          <w:b/>
+        </w:rPr>
+        <w:t>)</w:t>
+      </w:r>
+    </w:p>
+    <w:p>
+      <w:pPr>
+        <w:spacing w:after="0" w:line="240" w:lineRule="auto" w:before="0"/>
+      </w:pPr>
+      <w:r>
+        <w:rPr>
+          <w:b/>
+          <w:vertAlign w:val="superscript"/>
+        </w:rPr>
+        <w:t>1</w:t>
+      </w:r>
+      <w:r>
+        <w:rPr>
+          <w:b/>
+        </w:rPr>
+        <w:t>H NMR</w:t>
+      </w:r>
+      <w:r>
+        <w:rPr>
+          <w:b/>
+        </w:rPr>
+        <w:t xml:space="preserve"> (</w:t>
+      </w:r>
+      <w:r>
+        <w:rPr>
+          <w:b/>
+        </w:rPr>
+        <w:t>CDCl</w:t>
+      </w:r>
+      <w:r>
+        <w:rPr>
+          <w:b/>
+          <w:vertAlign w:val="subscript"/>
+        </w:rPr>
+        <w:t>3</w:t>
+      </w:r>
+      <w:r>
+        <w:rPr>
+          <w:b/>
+        </w:rPr>
+        <w:t>, 600 MHz</w:t>
+      </w:r>
+      <w:r>
+        <w:rPr>
+          <w:b/>
+        </w:rPr>
+        <w:t>)</w:t>
+      </w:r>
+    </w:p>
+    <w:p>
+      <w:pPr>
+        <w:spacing w:after="0" w:line="20" w:lineRule="exact" w:before="0"/>
+      </w:pPr>
+      <w:r>
+        <w:object w:dxaOrig="1963" w:dyaOrig="1289">
+          <v:shape id="_x0000_i1026" type="#_x0000_t75" style="position:absolute;left:0;text-align:left;margin-left:0pt;margin-top:0pt;width:98.25pt;height:64.5pt;z-index:251659264" o:ole="" o:allowoverlap="t">
+            <v:imagedata r:id="rIdSI53" o:title=""/>
+            <w10:wrap type="none"/>
+          </v:shape>
+          <o:OLEObject Type="Embed" ProgID="ChemDraw.Document" ShapeID="_x0000_i1026" DrawAspect="Content" ObjectID="_1851838594" r:id="rIdSI54"/>
         </w:object>
       </w:r>
     </w:p>
@@ -3744,7 +2316,7 @@
               <ns2:graphicData uri="http://schemas.openxmlformats.org/drawingml/2006/picture">
                 <ns3:pic>
                   <ns3:nvPicPr>
-                    <ns3:cNvPr id="0" name="2a_13C.png"/>
+                    <ns3:cNvPr id="0" name="2b_1H.png"/>
                     <ns3:cNvPicPr/>
                   </ns3:nvPicPr>
                   <ns3:blipFill>
@@ -3766,7 +2338,7 @@
           </ns1:inline>
         </w:drawing>
       </w:r>
-      <w:bookmarkEnd w:id="4078659376"/>
+      <w:bookmarkEnd w:id="3299855004"/>
     </w:p>
     <w:p>
       <w:r>
@@ -3777,7 +2349,7 @@
       <w:pPr>
         <w:spacing w:after="0" w:line="240" w:lineRule="auto" w:before="0"/>
       </w:pPr>
-      <w:bookmarkStart w:id="670823333" w:name="asig_spectrum_cmp_001_2D_1_a7d243f5"/>
+      <w:bookmarkStart w:id="2727030293" w:name="asig_spectrum_cmp_002_13C_7e29b869"/>
       <w:r>
         <w:rPr>
           <w:b/>
@@ -3795,7 +2367,7 @@
         <w:rPr>
           <w:b/>
         </w:rPr>
-        <w:t>)-3-(2-(bromomethyl)phenyl)acrylate</w:t>
+        <w:t>)-3-(2-(bromomethyl)-4-fluorophenyl)acrylate</w:t>
       </w:r>
       <w:r>
         <w:rPr>
@@ -3807,7 +2379,7 @@
         <w:rPr>
           <w:b/>
         </w:rPr>
-        <w:t>2a</w:t>
+        <w:t>2b</w:t>
       </w:r>
       <w:r>
         <w:rPr>
@@ -3823,27 +2395,8 @@
       <w:r>
         <w:rPr>
           <w:b/>
-        </w:rPr>
-        <w:t xml:space="preserve">HMBC </w:t>
-      </w:r>
-      <w:r>
-        <w:rPr>
-          <w:b/>
           <w:vertAlign w:val="superscript"/>
         </w:rPr>
-        <w:t>1</w:t>
-      </w:r>
-      <w:r>
-        <w:rPr>
-          <w:b/>
-        </w:rPr>
-        <w:t>H–</w:t>
-      </w:r>
-      <w:r>
-        <w:rPr>
-          <w:b/>
-          <w:vertAlign w:val="superscript"/>
-        </w:rPr>
         <w:t>13</w:t>
       </w:r>
       <w:r>
@@ -3870,6 +2423,12 @@
           <w:vertAlign w:val="subscript"/>
         </w:rPr>
         <w:t>3</w:t>
+      </w:r>
+      <w:r>
+        <w:rPr>
+          <w:b/>
+        </w:rPr>
+        <w:t>, 150 MHz</w:t>
       </w:r>
       <w:r>
         <w:rPr>
@@ -3880,34 +2439,15 @@
     </w:p>
     <w:p>
       <w:pPr>
-        <w:spacing w:after="1080" w:line="20" w:lineRule="exact" w:before="0"/>
+        <w:spacing w:after="0" w:line="20" w:lineRule="exact" w:before="0"/>
       </w:pPr>
       <w:r>
-        <w:object w:dxaOrig="1661" w:dyaOrig="1289">
-          <v:shapetype id="_x0000_t75" coordsize="21600,21600" o:spt="75" o:preferrelative="t" path="m@4@5l@4@11@9@11@9@5xe" filled="f" stroked="f">
-            <v:stroke joinstyle="miter"/>
-            <v:formulas>
-              <v:f eqn="if lineDrawn pixelLineWidth 0"/>
-              <v:f eqn="sum @0 1 0"/>
-              <v:f eqn="sum 0 0 @1"/>
-              <v:f eqn="prod @2 1 2"/>
-              <v:f eqn="prod @3 21600 pixelWidth"/>
-              <v:f eqn="prod @3 21600 pixelHeight"/>
-              <v:f eqn="sum @0 0 1"/>
-              <v:f eqn="prod @6 1 2"/>
-              <v:f eqn="prod @7 21600 pixelWidth"/>
-              <v:f eqn="sum @8 21600 0"/>
-              <v:f eqn="prod @7 21600 pixelHeight"/>
-              <v:f eqn="sum @10 21600 0"/>
-            </v:formulas>
-            <v:path o:extrusionok="f" gradientshapeok="t" o:connecttype="rect"/>
-            <o:lock v:ext="edit" aspectratio="t"/>
-          </v:shapetype>
-          <v:shape id="_x0000_i1025" type="#_x0000_t75" style="position:absolute;left:0;text-align:left;margin-left:0pt;margin-top:0pt;width:83.25pt;height:64.5pt;z-index:251659264" o:ole="" o:allowoverlap="t">
-            <v:imagedata r:id="rIdSI53" o:title=""/>
+        <w:object w:dxaOrig="1963" w:dyaOrig="1289">
+          <v:shape id="_x0000_i1026" type="#_x0000_t75" style="position:absolute;left:0;text-align:left;margin-left:0pt;margin-top:0pt;width:98.25pt;height:64.5pt;z-index:251659264" o:ole="" o:allowoverlap="t">
+            <v:imagedata r:id="rIdSI51" o:title=""/>
             <w10:wrap type="none"/>
           </v:shape>
-          <o:OLEObject Type="Embed" ProgID="ChemDraw.Document" ShapeID="_x0000_i1025" DrawAspect="Content" ObjectID="_1851838593" r:id="rIdSI54"/>
+          <o:OLEObject Type="Embed" ProgID="ChemDraw.Document" ShapeID="_x0000_i1026" DrawAspect="Content" ObjectID="_1851838594" r:id="rIdSI52"/>
         </w:object>
       </w:r>
     </w:p>
@@ -3918,7 +2458,7 @@
       <w:r>
         <w:drawing>
           <ns1:inline>
-            <ns1:extent cx="5972810" cy="4230740"/>
+            <ns1:extent cx="5972810" cy="4167444"/>
             <ns1:docPr id="4" name="Picture 4"/>
             <ns1:cNvGraphicFramePr>
               <ns2:graphicFrameLocks noChangeAspect="1"/>
@@ -3927,7 +2467,7 @@
               <ns2:graphicData uri="http://schemas.openxmlformats.org/drawingml/2006/picture">
                 <ns3:pic>
                   <ns3:nvPicPr>
-                    <ns3:cNvPr id="0" name="2a_HMBC.png"/>
+                    <ns3:cNvPr id="0" name="2b_13C.png"/>
                     <ns3:cNvPicPr/>
                   </ns3:nvPicPr>
                   <ns3:blipFill>
@@ -3939,7 +2479,7 @@
                   <ns3:spPr>
                     <ns2:xfrm>
                       <ns2:off x="0" y="0"/>
-                      <ns2:ext cx="5972810" cy="4230740"/>
+                      <ns2:ext cx="5972810" cy="4167444"/>
                     </ns2:xfrm>
                     <ns2:prstGeom prst="rect"/>
                   </ns3:spPr>
@@ -3949,7 +2489,7 @@
           </ns1:inline>
         </w:drawing>
       </w:r>
-      <w:bookmarkEnd w:id="670823333"/>
+      <w:bookmarkEnd w:id="2727030293"/>
     </w:p>
     <w:p>
       <w:r>
@@ -3960,7 +2500,7 @@
       <w:pPr>
         <w:spacing w:after="0" w:line="240" w:lineRule="auto" w:before="0"/>
       </w:pPr>
-      <w:bookmarkStart w:id="1041036407" w:name="asig_spectrum_cmp_001_2D_2_22df96cb"/>
+      <w:bookmarkStart w:id="970109309" w:name="asig_spectrum_cmp_003_1H_f17ca0f1"/>
       <w:r>
         <w:rPr>
           <w:b/>
@@ -3978,7 +2518,7 @@
         <w:rPr>
           <w:b/>
         </w:rPr>
-        <w:t>)-3-(2-(bromomethyl)phenyl)acrylate</w:t>
+        <w:t>)-3-(2-(bromomethyl)-5-fluorophenyl)acrylate</w:t>
       </w:r>
       <w:r>
         <w:rPr>
@@ -3990,7 +2530,7 @@
         <w:rPr>
           <w:b/>
         </w:rPr>
-        <w:t>2a</w:t>
+        <w:t>2c</w:t>
       </w:r>
       <w:r>
         <w:rPr>
@@ -4006,12 +2546,6 @@
       <w:r>
         <w:rPr>
           <w:b/>
-        </w:rPr>
-        <w:t xml:space="preserve">HSQC </w:t>
-      </w:r>
-      <w:r>
-        <w:rPr>
-          <w:b/>
           <w:vertAlign w:val="superscript"/>
         </w:rPr>
         <w:t>1</w:t>
@@ -4020,20 +2554,7 @@
         <w:rPr>
           <w:b/>
         </w:rPr>
-        <w:t>H–</w:t>
-      </w:r>
-      <w:r>
-        <w:rPr>
-          <w:b/>
-          <w:vertAlign w:val="superscript"/>
-        </w:rPr>
-        <w:t>13</w:t>
-      </w:r>
-      <w:r>
-        <w:rPr>
-          <w:b/>
-        </w:rPr>
-        <w:t>C NMR</w:t>
+        <w:t>H NMR</w:t>
       </w:r>
       <w:r>
         <w:rPr>
@@ -4053,6 +2574,12 @@
           <w:vertAlign w:val="subscript"/>
         </w:rPr>
         <w:t>3</w:t>
+      </w:r>
+      <w:r>
+        <w:rPr>
+          <w:b/>
+        </w:rPr>
+        <w:t>, 600 MHz</w:t>
       </w:r>
       <w:r>
         <w:rPr>
@@ -4063,34 +2590,15 @@
     </w:p>
     <w:p>
       <w:pPr>
-        <w:spacing w:after="1080" w:line="20" w:lineRule="exact" w:before="0"/>
+        <w:spacing w:after="0" w:line="20" w:lineRule="exact" w:before="0"/>
       </w:pPr>
       <w:r>
-        <w:object w:dxaOrig="1661" w:dyaOrig="1289">
-          <v:shapetype id="_x0000_t75" coordsize="21600,21600" o:spt="75" o:preferrelative="t" path="m@4@5l@4@11@9@11@9@5xe" filled="f" stroked="f">
-            <v:stroke joinstyle="miter"/>
-            <v:formulas>
-              <v:f eqn="if lineDrawn pixelLineWidth 0"/>
-              <v:f eqn="sum @0 1 0"/>
-              <v:f eqn="sum 0 0 @1"/>
-              <v:f eqn="prod @2 1 2"/>
-              <v:f eqn="prod @3 21600 pixelWidth"/>
-              <v:f eqn="prod @3 21600 pixelHeight"/>
-              <v:f eqn="sum @0 0 1"/>
-              <v:f eqn="prod @6 1 2"/>
-              <v:f eqn="prod @7 21600 pixelWidth"/>
-              <v:f eqn="sum @8 21600 0"/>
-              <v:f eqn="prod @7 21600 pixelHeight"/>
-              <v:f eqn="sum @10 21600 0"/>
-            </v:formulas>
-            <v:path o:extrusionok="f" gradientshapeok="t" o:connecttype="rect"/>
-            <o:lock v:ext="edit" aspectratio="t"/>
-          </v:shapetype>
-          <v:shape id="_x0000_i1025" type="#_x0000_t75" style="position:absolute;left:0;text-align:left;margin-left:0pt;margin-top:0pt;width:83.25pt;height:64.5pt;z-index:251659264" o:ole="" o:allowoverlap="t">
-            <v:imagedata r:id="rIdSI55" o:title=""/>
+        <w:object w:dxaOrig="1965" w:dyaOrig="1289">
+          <v:shape id="_x0000_i1027" type="#_x0000_t75" style="position:absolute;left:0;text-align:left;margin-left:0pt;margin-top:0pt;width:98.25pt;height:64.5pt;z-index:251659264" o:ole="" o:allowoverlap="t">
+            <v:imagedata r:id="rIdSI59" o:title=""/>
             <w10:wrap type="none"/>
           </v:shape>
-          <o:OLEObject Type="Embed" ProgID="ChemDraw.Document" ShapeID="_x0000_i1025" DrawAspect="Content" ObjectID="_1851838593" r:id="rIdSI56"/>
+          <o:OLEObject Type="Embed" ProgID="ChemDraw.Document" ShapeID="_x0000_i1027" DrawAspect="Content" ObjectID="_1851838595" r:id="rIdSI60"/>
         </w:object>
       </w:r>
     </w:p>
@@ -4101,7 +2609,7 @@
       <w:r>
         <w:drawing>
           <ns1:inline>
-            <ns1:extent cx="5972810" cy="4230740"/>
+            <ns1:extent cx="5972810" cy="4167444"/>
             <ns1:docPr id="5" name="Picture 5"/>
             <ns1:cNvGraphicFramePr>
               <ns2:graphicFrameLocks noChangeAspect="1"/>
@@ -4110,7 +2618,7 @@
               <ns2:graphicData uri="http://schemas.openxmlformats.org/drawingml/2006/picture">
                 <ns3:pic>
                   <ns3:nvPicPr>
-                    <ns3:cNvPr id="0" name="2a_HSQC.png"/>
+                    <ns3:cNvPr id="0" name="2c_1H.png"/>
                     <ns3:cNvPicPr/>
                   </ns3:nvPicPr>
                   <ns3:blipFill>
@@ -4122,7 +2630,7 @@
                   <ns3:spPr>
                     <ns2:xfrm>
                       <ns2:off x="0" y="0"/>
-                      <ns2:ext cx="5972810" cy="4230740"/>
+                      <ns2:ext cx="5972810" cy="4167444"/>
                     </ns2:xfrm>
                     <ns2:prstGeom prst="rect"/>
                   </ns3:spPr>
@@ -4132,7 +2640,7 @@
           </ns1:inline>
         </w:drawing>
       </w:r>
-      <w:bookmarkEnd w:id="1041036407"/>
+      <w:bookmarkEnd w:id="970109309"/>
     </w:p>
     <w:p>
       <w:r>
@@ -4143,7 +2651,7 @@
       <w:pPr>
         <w:spacing w:after="0" w:line="240" w:lineRule="auto" w:before="0"/>
       </w:pPr>
-      <w:bookmarkStart w:id="1508901260" w:name="asig_spectrum_cmp_001_2D_3_34ac0867"/>
+      <w:bookmarkStart w:id="2837574293" w:name="asig_spectrum_cmp_003_13C_f649a3cc"/>
       <w:r>
         <w:rPr>
           <w:b/>
@@ -4161,7 +2669,7 @@
         <w:rPr>
           <w:b/>
         </w:rPr>
-        <w:t>)-3-(2-(bromomethyl)phenyl)acrylate</w:t>
+        <w:t>)-3-(2-(bromomethyl)-5-fluorophenyl)acrylate</w:t>
       </w:r>
       <w:r>
         <w:rPr>
@@ -4173,7 +2681,7 @@
         <w:rPr>
           <w:b/>
         </w:rPr>
-        <w:t>2a</w:t>
+        <w:t>2c</w:t>
       </w:r>
       <w:r>
         <w:rPr>
@@ -4189,34 +2697,15 @@
       <w:r>
         <w:rPr>
           <w:b/>
-        </w:rPr>
-        <w:t xml:space="preserve">NOESY </w:t>
-      </w:r>
-      <w:r>
-        <w:rPr>
-          <w:b/>
           <w:vertAlign w:val="superscript"/>
         </w:rPr>
-        <w:t>1</w:t>
-      </w:r>
-      <w:r>
-        <w:rPr>
-          <w:b/>
-        </w:rPr>
-        <w:t>H–</w:t>
-      </w:r>
-      <w:r>
-        <w:rPr>
-          <w:b/>
-          <w:vertAlign w:val="superscript"/>
-        </w:rPr>
-        <w:t>1</w:t>
-      </w:r>
-      <w:r>
-        <w:rPr>
-          <w:b/>
-        </w:rPr>
-        <w:t>H NMR</w:t>
+        <w:t>13</w:t>
+      </w:r>
+      <w:r>
+        <w:rPr>
+          <w:b/>
+        </w:rPr>
+        <w:t>C NMR</w:t>
       </w:r>
       <w:r>
         <w:rPr>
@@ -4236,6 +2725,12 @@
           <w:vertAlign w:val="subscript"/>
         </w:rPr>
         <w:t>3</w:t>
+      </w:r>
+      <w:r>
+        <w:rPr>
+          <w:b/>
+        </w:rPr>
+        <w:t>, 150 MHz</w:t>
       </w:r>
       <w:r>
         <w:rPr>
@@ -4246,34 +2741,15 @@
     </w:p>
     <w:p>
       <w:pPr>
-        <w:spacing w:after="1080" w:line="20" w:lineRule="exact" w:before="0"/>
+        <w:spacing w:after="0" w:line="20" w:lineRule="exact" w:before="0"/>
       </w:pPr>
       <w:r>
-        <w:object w:dxaOrig="1661" w:dyaOrig="1289">
-          <v:shapetype id="_x0000_t75" coordsize="21600,21600" o:spt="75" o:preferrelative="t" path="m@4@5l@4@11@9@11@9@5xe" filled="f" stroked="f">
-            <v:stroke joinstyle="miter"/>
-            <v:formulas>
-              <v:f eqn="if lineDrawn pixelLineWidth 0"/>
-              <v:f eqn="sum @0 1 0"/>
-              <v:f eqn="sum 0 0 @1"/>
-              <v:f eqn="prod @2 1 2"/>
-              <v:f eqn="prod @3 21600 pixelWidth"/>
-              <v:f eqn="prod @3 21600 pixelHeight"/>
-              <v:f eqn="sum @0 0 1"/>
-              <v:f eqn="prod @6 1 2"/>
-              <v:f eqn="prod @7 21600 pixelWidth"/>
-              <v:f eqn="sum @8 21600 0"/>
-              <v:f eqn="prod @7 21600 pixelHeight"/>
-              <v:f eqn="sum @10 21600 0"/>
-            </v:formulas>
-            <v:path o:extrusionok="f" gradientshapeok="t" o:connecttype="rect"/>
-            <o:lock v:ext="edit" aspectratio="t"/>
-          </v:shapetype>
-          <v:shape id="_x0000_i1025" type="#_x0000_t75" style="position:absolute;left:0;text-align:left;margin-left:0pt;margin-top:0pt;width:83.25pt;height:64.5pt;z-index:251659264" o:ole="" o:allowoverlap="t">
+        <w:object w:dxaOrig="1965" w:dyaOrig="1289">
+          <v:shape id="_x0000_i1027" type="#_x0000_t75" style="position:absolute;left:0;text-align:left;margin-left:0pt;margin-top:0pt;width:98.25pt;height:64.5pt;z-index:251659264" o:ole="" o:allowoverlap="t">
             <v:imagedata r:id="rIdSI57" o:title=""/>
             <w10:wrap type="none"/>
           </v:shape>
-          <o:OLEObject Type="Embed" ProgID="ChemDraw.Document" ShapeID="_x0000_i1025" DrawAspect="Content" ObjectID="_1851838593" r:id="rIdSI58"/>
+          <o:OLEObject Type="Embed" ProgID="ChemDraw.Document" ShapeID="_x0000_i1027" DrawAspect="Content" ObjectID="_1851838595" r:id="rIdSI58"/>
         </w:object>
       </w:r>
     </w:p>
@@ -4284,7 +2760,7 @@
       <w:r>
         <w:drawing>
           <ns1:inline>
-            <ns1:extent cx="5972810" cy="4230740"/>
+            <ns1:extent cx="5972810" cy="4167444"/>
             <ns1:docPr id="6" name="Picture 6"/>
             <ns1:cNvGraphicFramePr>
               <ns2:graphicFrameLocks noChangeAspect="1"/>
@@ -4293,7 +2769,7 @@
               <ns2:graphicData uri="http://schemas.openxmlformats.org/drawingml/2006/picture">
                 <ns3:pic>
                   <ns3:nvPicPr>
-                    <ns3:cNvPr id="0" name="2a_NOESY.png"/>
+                    <ns3:cNvPr id="0" name="2c_13C.png"/>
                     <ns3:cNvPicPr/>
                   </ns3:nvPicPr>
                   <ns3:blipFill>
@@ -4305,7 +2781,7 @@
                   <ns3:spPr>
                     <ns2:xfrm>
                       <ns2:off x="0" y="0"/>
-                      <ns2:ext cx="5972810" cy="4230740"/>
+                      <ns2:ext cx="5972810" cy="4167444"/>
                     </ns2:xfrm>
                     <ns2:prstGeom prst="rect"/>
                   </ns3:spPr>
@@ -4315,7 +2791,7 @@
           </ns1:inline>
         </w:drawing>
       </w:r>
-      <w:bookmarkEnd w:id="1508901260"/>
+      <w:bookmarkEnd w:id="2837574293"/>
     </w:p>
     <w:p>
       <w:r>
@@ -4326,7 +2802,7 @@
       <w:pPr>
         <w:spacing w:after="0" w:line="240" w:lineRule="auto" w:before="0"/>
       </w:pPr>
-      <w:bookmarkStart w:id="3299855004" w:name="asig_spectrum_cmp_002_1H_9f900130"/>
+      <w:bookmarkStart w:id="4118182246" w:name="asig_spectrum_cmp_004_1H_6199570c"/>
       <w:r>
         <w:rPr>
           <w:b/>
@@ -4344,7 +2820,7 @@
         <w:rPr>
           <w:b/>
         </w:rPr>
-        <w:t>)-3-(2-(bromomethyl)-4-fluorophenyl)acrylate</w:t>
+        <w:t>)-3-(2-(bromomethyl)-5-nitrophenyl)acrylate</w:t>
       </w:r>
       <w:r>
         <w:rPr>
@@ -4356,7 +2832,7 @@
         <w:rPr>
           <w:b/>
         </w:rPr>
-        <w:t>2b</w:t>
+        <w:t>2d</w:t>
       </w:r>
       <w:r>
         <w:rPr>
@@ -4419,12 +2895,12 @@
         <w:spacing w:after="0" w:line="20" w:lineRule="exact" w:before="0"/>
       </w:pPr>
       <w:r>
-        <w:object w:dxaOrig="1963" w:dyaOrig="1289">
-          <v:shape id="_x0000_i1026" type="#_x0000_t75" style="position:absolute;left:0;text-align:left;margin-left:0pt;margin-top:0pt;width:98.25pt;height:64.5pt;z-index:251659264" o:ole="" o:allowoverlap="t">
-            <v:imagedata r:id="rIdSI63" o:title=""/>
+        <w:object w:dxaOrig="2216" w:dyaOrig="1289">
+          <v:shape id="_x0000_i1028" type="#_x0000_t75" style="position:absolute;left:0;text-align:left;margin-left:0pt;margin-top:0pt;width:111pt;height:64.5pt;z-index:251659264" o:ole="" o:allowoverlap="t">
+            <v:imagedata r:id="rIdSI65" o:title=""/>
             <w10:wrap type="none"/>
           </v:shape>
-          <o:OLEObject Type="Embed" ProgID="ChemDraw.Document" ShapeID="_x0000_i1026" DrawAspect="Content" ObjectID="_1851838594" r:id="rIdSI64"/>
+          <o:OLEObject Type="Embed" ProgID="ChemDraw.Document" ShapeID="_x0000_i1028" DrawAspect="Content" ObjectID="_1851838596" r:id="rIdSI66"/>
         </w:object>
       </w:r>
     </w:p>
@@ -4444,7 +2920,7 @@
               <ns2:graphicData uri="http://schemas.openxmlformats.org/drawingml/2006/picture">
                 <ns3:pic>
                   <ns3:nvPicPr>
-                    <ns3:cNvPr id="0" name="2b_1H.png"/>
+                    <ns3:cNvPr id="0" name="2d_1H.png"/>
                     <ns3:cNvPicPr/>
                   </ns3:nvPicPr>
                   <ns3:blipFill>
@@ -4466,7 +2942,7 @@
           </ns1:inline>
         </w:drawing>
       </w:r>
-      <w:bookmarkEnd w:id="3299855004"/>
+      <w:bookmarkEnd w:id="4118182246"/>
     </w:p>
     <w:p>
       <w:r>
@@ -4477,7 +2953,7 @@
       <w:pPr>
         <w:spacing w:after="0" w:line="240" w:lineRule="auto" w:before="0"/>
       </w:pPr>
-      <w:bookmarkStart w:id="2727030293" w:name="asig_spectrum_cmp_002_13C_7e29b869"/>
+      <w:bookmarkStart w:id="3014925642" w:name="asig_spectrum_cmp_004_13C_d0b9ce96"/>
       <w:r>
         <w:rPr>
           <w:b/>
@@ -4495,7 +2971,7 @@
         <w:rPr>
           <w:b/>
         </w:rPr>
-        <w:t>)-3-(2-(bromomethyl)-4-fluorophenyl)acrylate</w:t>
+        <w:t>)-3-(2-(bromomethyl)-5-nitrophenyl)acrylate</w:t>
       </w:r>
       <w:r>
         <w:rPr>
@@ -4507,7 +2983,7 @@
         <w:rPr>
           <w:b/>
         </w:rPr>
-        <w:t>2b</w:t>
+        <w:t>2d</w:t>
       </w:r>
       <w:r>
         <w:rPr>
@@ -4570,12 +3046,12 @@
         <w:spacing w:after="0" w:line="20" w:lineRule="exact" w:before="0"/>
       </w:pPr>
       <w:r>
-        <w:object w:dxaOrig="1963" w:dyaOrig="1289">
-          <v:shape id="_x0000_i1026" type="#_x0000_t75" style="position:absolute;left:0;text-align:left;margin-left:0pt;margin-top:0pt;width:98.25pt;height:64.5pt;z-index:251659264" o:ole="" o:allowoverlap="t">
-            <v:imagedata r:id="rIdSI61" o:title=""/>
+        <w:object w:dxaOrig="2216" w:dyaOrig="1289">
+          <v:shape id="_x0000_i1028" type="#_x0000_t75" style="position:absolute;left:0;text-align:left;margin-left:0pt;margin-top:0pt;width:111pt;height:64.5pt;z-index:251659264" o:ole="" o:allowoverlap="t">
+            <v:imagedata r:id="rIdSI63" o:title=""/>
             <w10:wrap type="none"/>
           </v:shape>
-          <o:OLEObject Type="Embed" ProgID="ChemDraw.Document" ShapeID="_x0000_i1026" DrawAspect="Content" ObjectID="_1851838594" r:id="rIdSI62"/>
+          <o:OLEObject Type="Embed" ProgID="ChemDraw.Document" ShapeID="_x0000_i1028" DrawAspect="Content" ObjectID="_1851838596" r:id="rIdSI64"/>
         </w:object>
       </w:r>
     </w:p>
@@ -4595,615 +3071,11 @@
               <ns2:graphicData uri="http://schemas.openxmlformats.org/drawingml/2006/picture">
                 <ns3:pic>
                   <ns3:nvPicPr>
-                    <ns3:cNvPr id="0" name="2b_13C.png"/>
+                    <ns3:cNvPr id="0" name="2d_13C.png"/>
                     <ns3:cNvPicPr/>
                   </ns3:nvPicPr>
                   <ns3:blipFill>
                     <ns2:blip r:embed="rId41"/>
-                    <ns2:stretch>
-                      <ns2:fillRect/>
-                    </ns2:stretch>
-                  </ns3:blipFill>
-                  <ns3:spPr>
-                    <ns2:xfrm>
-                      <ns2:off x="0" y="0"/>
-                      <ns2:ext cx="5972810" cy="4167444"/>
-                    </ns2:xfrm>
-                    <ns2:prstGeom prst="rect"/>
-                  </ns3:spPr>
-                </ns3:pic>
-              </ns2:graphicData>
-            </ns2:graphic>
-          </ns1:inline>
-        </w:drawing>
-      </w:r>
-      <w:bookmarkEnd w:id="2727030293"/>
-    </w:p>
-    <w:p>
-      <w:r>
-        <w:br w:type="page"/>
-      </w:r>
-    </w:p>
-    <w:p>
-      <w:pPr>
-        <w:spacing w:after="0" w:line="240" w:lineRule="auto" w:before="0"/>
-      </w:pPr>
-      <w:bookmarkStart w:id="970109309" w:name="asig_spectrum_cmp_003_1H_f17ca0f1"/>
-      <w:r>
-        <w:rPr>
-          <w:b/>
-        </w:rPr>
-        <w:t>Methyl (</w:t>
-      </w:r>
-      <w:r>
-        <w:rPr>
-          <w:b/>
-          <w:i/>
-        </w:rPr>
-        <w:t>E</w:t>
-      </w:r>
-      <w:r>
-        <w:rPr>
-          <w:b/>
-        </w:rPr>
-        <w:t>)-3-(2-(bromomethyl)-5-fluorophenyl)acrylate</w:t>
-      </w:r>
-      <w:r>
-        <w:rPr>
-          <w:b/>
-        </w:rPr>
-        <w:t xml:space="preserve"> (</w:t>
-      </w:r>
-      <w:r>
-        <w:rPr>
-          <w:b/>
-        </w:rPr>
-        <w:t>2c</w:t>
-      </w:r>
-      <w:r>
-        <w:rPr>
-          <w:b/>
-        </w:rPr>
-        <w:t>)</w:t>
-      </w:r>
-    </w:p>
-    <w:p>
-      <w:pPr>
-        <w:spacing w:after="0" w:line="240" w:lineRule="auto" w:before="0"/>
-      </w:pPr>
-      <w:r>
-        <w:rPr>
-          <w:b/>
-          <w:vertAlign w:val="superscript"/>
-        </w:rPr>
-        <w:t>1</w:t>
-      </w:r>
-      <w:r>
-        <w:rPr>
-          <w:b/>
-        </w:rPr>
-        <w:t>H NMR</w:t>
-      </w:r>
-      <w:r>
-        <w:rPr>
-          <w:b/>
-        </w:rPr>
-        <w:t xml:space="preserve"> (</w:t>
-      </w:r>
-      <w:r>
-        <w:rPr>
-          <w:b/>
-        </w:rPr>
-        <w:t>CDCl</w:t>
-      </w:r>
-      <w:r>
-        <w:rPr>
-          <w:b/>
-          <w:vertAlign w:val="subscript"/>
-        </w:rPr>
-        <w:t>3</w:t>
-      </w:r>
-      <w:r>
-        <w:rPr>
-          <w:b/>
-        </w:rPr>
-        <w:t>, 600 MHz</w:t>
-      </w:r>
-      <w:r>
-        <w:rPr>
-          <w:b/>
-        </w:rPr>
-        <w:t>)</w:t>
-      </w:r>
-    </w:p>
-    <w:p>
-      <w:pPr>
-        <w:spacing w:after="0" w:line="20" w:lineRule="exact" w:before="0"/>
-      </w:pPr>
-      <w:r>
-        <w:object w:dxaOrig="1965" w:dyaOrig="1289">
-          <v:shape id="_x0000_i1027" type="#_x0000_t75" style="position:absolute;left:0;text-align:left;margin-left:0pt;margin-top:0pt;width:98.25pt;height:64.5pt;z-index:251659264" o:ole="" o:allowoverlap="t">
-            <v:imagedata r:id="rIdSI69" o:title=""/>
-            <w10:wrap type="none"/>
-          </v:shape>
-          <o:OLEObject Type="Embed" ProgID="ChemDraw.Document" ShapeID="_x0000_i1027" DrawAspect="Content" ObjectID="_1851838595" r:id="rIdSI70"/>
-        </w:object>
-      </w:r>
-    </w:p>
-    <w:p>
-      <w:pPr>
-        <w:spacing w:before="0" w:after="0"/>
-      </w:pPr>
-      <w:r>
-        <w:drawing>
-          <ns1:inline>
-            <ns1:extent cx="5972810" cy="4167444"/>
-            <ns1:docPr id="9" name="Picture 9"/>
-            <ns1:cNvGraphicFramePr>
-              <ns2:graphicFrameLocks noChangeAspect="1"/>
-            </ns1:cNvGraphicFramePr>
-            <ns2:graphic>
-              <ns2:graphicData uri="http://schemas.openxmlformats.org/drawingml/2006/picture">
-                <ns3:pic>
-                  <ns3:nvPicPr>
-                    <ns3:cNvPr id="0" name="2c_1H.png"/>
-                    <ns3:cNvPicPr/>
-                  </ns3:nvPicPr>
-                  <ns3:blipFill>
-                    <ns2:blip r:embed="rId42"/>
-                    <ns2:stretch>
-                      <ns2:fillRect/>
-                    </ns2:stretch>
-                  </ns3:blipFill>
-                  <ns3:spPr>
-                    <ns2:xfrm>
-                      <ns2:off x="0" y="0"/>
-                      <ns2:ext cx="5972810" cy="4167444"/>
-                    </ns2:xfrm>
-                    <ns2:prstGeom prst="rect"/>
-                  </ns3:spPr>
-                </ns3:pic>
-              </ns2:graphicData>
-            </ns2:graphic>
-          </ns1:inline>
-        </w:drawing>
-      </w:r>
-      <w:bookmarkEnd w:id="970109309"/>
-    </w:p>
-    <w:p>
-      <w:r>
-        <w:br w:type="page"/>
-      </w:r>
-    </w:p>
-    <w:p>
-      <w:pPr>
-        <w:spacing w:after="0" w:line="240" w:lineRule="auto" w:before="0"/>
-      </w:pPr>
-      <w:bookmarkStart w:id="2837574293" w:name="asig_spectrum_cmp_003_13C_f649a3cc"/>
-      <w:r>
-        <w:rPr>
-          <w:b/>
-        </w:rPr>
-        <w:t>Methyl (</w:t>
-      </w:r>
-      <w:r>
-        <w:rPr>
-          <w:b/>
-          <w:i/>
-        </w:rPr>
-        <w:t>E</w:t>
-      </w:r>
-      <w:r>
-        <w:rPr>
-          <w:b/>
-        </w:rPr>
-        <w:t>)-3-(2-(bromomethyl)-5-fluorophenyl)acrylate</w:t>
-      </w:r>
-      <w:r>
-        <w:rPr>
-          <w:b/>
-        </w:rPr>
-        <w:t xml:space="preserve"> (</w:t>
-      </w:r>
-      <w:r>
-        <w:rPr>
-          <w:b/>
-        </w:rPr>
-        <w:t>2c</w:t>
-      </w:r>
-      <w:r>
-        <w:rPr>
-          <w:b/>
-        </w:rPr>
-        <w:t>)</w:t>
-      </w:r>
-    </w:p>
-    <w:p>
-      <w:pPr>
-        <w:spacing w:after="0" w:line="240" w:lineRule="auto" w:before="0"/>
-      </w:pPr>
-      <w:r>
-        <w:rPr>
-          <w:b/>
-          <w:vertAlign w:val="superscript"/>
-        </w:rPr>
-        <w:t>13</w:t>
-      </w:r>
-      <w:r>
-        <w:rPr>
-          <w:b/>
-        </w:rPr>
-        <w:t>C NMR</w:t>
-      </w:r>
-      <w:r>
-        <w:rPr>
-          <w:b/>
-        </w:rPr>
-        <w:t xml:space="preserve"> (</w:t>
-      </w:r>
-      <w:r>
-        <w:rPr>
-          <w:b/>
-        </w:rPr>
-        <w:t>CDCl</w:t>
-      </w:r>
-      <w:r>
-        <w:rPr>
-          <w:b/>
-          <w:vertAlign w:val="subscript"/>
-        </w:rPr>
-        <w:t>3</w:t>
-      </w:r>
-      <w:r>
-        <w:rPr>
-          <w:b/>
-        </w:rPr>
-        <w:t>, 150 MHz</w:t>
-      </w:r>
-      <w:r>
-        <w:rPr>
-          <w:b/>
-        </w:rPr>
-        <w:t>)</w:t>
-      </w:r>
-    </w:p>
-    <w:p>
-      <w:pPr>
-        <w:spacing w:after="0" w:line="20" w:lineRule="exact" w:before="0"/>
-      </w:pPr>
-      <w:r>
-        <w:object w:dxaOrig="1965" w:dyaOrig="1289">
-          <v:shape id="_x0000_i1027" type="#_x0000_t75" style="position:absolute;left:0;text-align:left;margin-left:0pt;margin-top:0pt;width:98.25pt;height:64.5pt;z-index:251659264" o:ole="" o:allowoverlap="t">
-            <v:imagedata r:id="rIdSI67" o:title=""/>
-            <w10:wrap type="none"/>
-          </v:shape>
-          <o:OLEObject Type="Embed" ProgID="ChemDraw.Document" ShapeID="_x0000_i1027" DrawAspect="Content" ObjectID="_1851838595" r:id="rIdSI68"/>
-        </w:object>
-      </w:r>
-    </w:p>
-    <w:p>
-      <w:pPr>
-        <w:spacing w:before="0" w:after="0"/>
-      </w:pPr>
-      <w:r>
-        <w:drawing>
-          <ns1:inline>
-            <ns1:extent cx="5972810" cy="4167444"/>
-            <ns1:docPr id="10" name="Picture 10"/>
-            <ns1:cNvGraphicFramePr>
-              <ns2:graphicFrameLocks noChangeAspect="1"/>
-            </ns1:cNvGraphicFramePr>
-            <ns2:graphic>
-              <ns2:graphicData uri="http://schemas.openxmlformats.org/drawingml/2006/picture">
-                <ns3:pic>
-                  <ns3:nvPicPr>
-                    <ns3:cNvPr id="0" name="2c_13C.png"/>
-                    <ns3:cNvPicPr/>
-                  </ns3:nvPicPr>
-                  <ns3:blipFill>
-                    <ns2:blip r:embed="rId43"/>
-                    <ns2:stretch>
-                      <ns2:fillRect/>
-                    </ns2:stretch>
-                  </ns3:blipFill>
-                  <ns3:spPr>
-                    <ns2:xfrm>
-                      <ns2:off x="0" y="0"/>
-                      <ns2:ext cx="5972810" cy="4167444"/>
-                    </ns2:xfrm>
-                    <ns2:prstGeom prst="rect"/>
-                  </ns3:spPr>
-                </ns3:pic>
-              </ns2:graphicData>
-            </ns2:graphic>
-          </ns1:inline>
-        </w:drawing>
-      </w:r>
-      <w:bookmarkEnd w:id="2837574293"/>
-    </w:p>
-    <w:p>
-      <w:r>
-        <w:br w:type="page"/>
-      </w:r>
-    </w:p>
-    <w:p>
-      <w:pPr>
-        <w:spacing w:after="0" w:line="240" w:lineRule="auto" w:before="0"/>
-      </w:pPr>
-      <w:bookmarkStart w:id="4118182246" w:name="asig_spectrum_cmp_004_1H_6199570c"/>
-      <w:r>
-        <w:rPr>
-          <w:b/>
-        </w:rPr>
-        <w:t>Methyl (</w:t>
-      </w:r>
-      <w:r>
-        <w:rPr>
-          <w:b/>
-          <w:i/>
-        </w:rPr>
-        <w:t>E</w:t>
-      </w:r>
-      <w:r>
-        <w:rPr>
-          <w:b/>
-        </w:rPr>
-        <w:t>)-3-(2-(bromomethyl)-5-nitrophenyl)acrylate</w:t>
-      </w:r>
-      <w:r>
-        <w:rPr>
-          <w:b/>
-        </w:rPr>
-        <w:t xml:space="preserve"> (</w:t>
-      </w:r>
-      <w:r>
-        <w:rPr>
-          <w:b/>
-        </w:rPr>
-        <w:t>2d</w:t>
-      </w:r>
-      <w:r>
-        <w:rPr>
-          <w:b/>
-        </w:rPr>
-        <w:t>)</w:t>
-      </w:r>
-    </w:p>
-    <w:p>
-      <w:pPr>
-        <w:spacing w:after="0" w:line="240" w:lineRule="auto" w:before="0"/>
-      </w:pPr>
-      <w:r>
-        <w:rPr>
-          <w:b/>
-          <w:vertAlign w:val="superscript"/>
-        </w:rPr>
-        <w:t>1</w:t>
-      </w:r>
-      <w:r>
-        <w:rPr>
-          <w:b/>
-        </w:rPr>
-        <w:t>H NMR</w:t>
-      </w:r>
-      <w:r>
-        <w:rPr>
-          <w:b/>
-        </w:rPr>
-        <w:t xml:space="preserve"> (</w:t>
-      </w:r>
-      <w:r>
-        <w:rPr>
-          <w:b/>
-        </w:rPr>
-        <w:t>CDCl</w:t>
-      </w:r>
-      <w:r>
-        <w:rPr>
-          <w:b/>
-          <w:vertAlign w:val="subscript"/>
-        </w:rPr>
-        <w:t>3</w:t>
-      </w:r>
-      <w:r>
-        <w:rPr>
-          <w:b/>
-        </w:rPr>
-        <w:t>, 600 MHz</w:t>
-      </w:r>
-      <w:r>
-        <w:rPr>
-          <w:b/>
-        </w:rPr>
-        <w:t>)</w:t>
-      </w:r>
-    </w:p>
-    <w:p>
-      <w:pPr>
-        <w:spacing w:after="0" w:line="20" w:lineRule="exact" w:before="0"/>
-      </w:pPr>
-      <w:r>
-        <w:object w:dxaOrig="2216" w:dyaOrig="1289">
-          <v:shape id="_x0000_i1028" type="#_x0000_t75" style="position:absolute;left:0;text-align:left;margin-left:0pt;margin-top:0pt;width:111pt;height:64.5pt;z-index:251659264" o:ole="" o:allowoverlap="t">
-            <v:imagedata r:id="rIdSI75" o:title=""/>
-            <w10:wrap type="none"/>
-          </v:shape>
-          <o:OLEObject Type="Embed" ProgID="ChemDraw.Document" ShapeID="_x0000_i1028" DrawAspect="Content" ObjectID="_1851838596" r:id="rIdSI76"/>
-        </w:object>
-      </w:r>
-    </w:p>
-    <w:p>
-      <w:pPr>
-        <w:spacing w:before="0" w:after="0"/>
-      </w:pPr>
-      <w:r>
-        <w:drawing>
-          <ns1:inline>
-            <ns1:extent cx="5972810" cy="4167444"/>
-            <ns1:docPr id="11" name="Picture 11"/>
-            <ns1:cNvGraphicFramePr>
-              <ns2:graphicFrameLocks noChangeAspect="1"/>
-            </ns1:cNvGraphicFramePr>
-            <ns2:graphic>
-              <ns2:graphicData uri="http://schemas.openxmlformats.org/drawingml/2006/picture">
-                <ns3:pic>
-                  <ns3:nvPicPr>
-                    <ns3:cNvPr id="0" name="2d_1H.png"/>
-                    <ns3:cNvPicPr/>
-                  </ns3:nvPicPr>
-                  <ns3:blipFill>
-                    <ns2:blip r:embed="rId44"/>
-                    <ns2:stretch>
-                      <ns2:fillRect/>
-                    </ns2:stretch>
-                  </ns3:blipFill>
-                  <ns3:spPr>
-                    <ns2:xfrm>
-                      <ns2:off x="0" y="0"/>
-                      <ns2:ext cx="5972810" cy="4167444"/>
-                    </ns2:xfrm>
-                    <ns2:prstGeom prst="rect"/>
-                  </ns3:spPr>
-                </ns3:pic>
-              </ns2:graphicData>
-            </ns2:graphic>
-          </ns1:inline>
-        </w:drawing>
-      </w:r>
-      <w:bookmarkEnd w:id="4118182246"/>
-    </w:p>
-    <w:p>
-      <w:r>
-        <w:br w:type="page"/>
-      </w:r>
-    </w:p>
-    <w:p>
-      <w:pPr>
-        <w:spacing w:after="0" w:line="240" w:lineRule="auto" w:before="0"/>
-      </w:pPr>
-      <w:bookmarkStart w:id="3014925642" w:name="asig_spectrum_cmp_004_13C_d0b9ce96"/>
-      <w:r>
-        <w:rPr>
-          <w:b/>
-        </w:rPr>
-        <w:t>Methyl (</w:t>
-      </w:r>
-      <w:r>
-        <w:rPr>
-          <w:b/>
-          <w:i/>
-        </w:rPr>
-        <w:t>E</w:t>
-      </w:r>
-      <w:r>
-        <w:rPr>
-          <w:b/>
-        </w:rPr>
-        <w:t>)-3-(2-(bromomethyl)-5-nitrophenyl)acrylate</w:t>
-      </w:r>
-      <w:r>
-        <w:rPr>
-          <w:b/>
-        </w:rPr>
-        <w:t xml:space="preserve"> (</w:t>
-      </w:r>
-      <w:r>
-        <w:rPr>
-          <w:b/>
-        </w:rPr>
-        <w:t>2d</w:t>
-      </w:r>
-      <w:r>
-        <w:rPr>
-          <w:b/>
-        </w:rPr>
-        <w:t>)</w:t>
-      </w:r>
-    </w:p>
-    <w:p>
-      <w:pPr>
-        <w:spacing w:after="0" w:line="240" w:lineRule="auto" w:before="0"/>
-      </w:pPr>
-      <w:r>
-        <w:rPr>
-          <w:b/>
-          <w:vertAlign w:val="superscript"/>
-        </w:rPr>
-        <w:t>13</w:t>
-      </w:r>
-      <w:r>
-        <w:rPr>
-          <w:b/>
-        </w:rPr>
-        <w:t>C NMR</w:t>
-      </w:r>
-      <w:r>
-        <w:rPr>
-          <w:b/>
-        </w:rPr>
-        <w:t xml:space="preserve"> (</w:t>
-      </w:r>
-      <w:r>
-        <w:rPr>
-          <w:b/>
-        </w:rPr>
-        <w:t>CDCl</w:t>
-      </w:r>
-      <w:r>
-        <w:rPr>
-          <w:b/>
-          <w:vertAlign w:val="subscript"/>
-        </w:rPr>
-        <w:t>3</w:t>
-      </w:r>
-      <w:r>
-        <w:rPr>
-          <w:b/>
-        </w:rPr>
-        <w:t>, 150 MHz</w:t>
-      </w:r>
-      <w:r>
-        <w:rPr>
-          <w:b/>
-        </w:rPr>
-        <w:t>)</w:t>
-      </w:r>
-    </w:p>
-    <w:p>
-      <w:pPr>
-        <w:spacing w:after="0" w:line="20" w:lineRule="exact" w:before="0"/>
-      </w:pPr>
-      <w:r>
-        <w:object w:dxaOrig="2216" w:dyaOrig="1289">
-          <v:shape id="_x0000_i1028" type="#_x0000_t75" style="position:absolute;left:0;text-align:left;margin-left:0pt;margin-top:0pt;width:111pt;height:64.5pt;z-index:251659264" o:ole="" o:allowoverlap="t">
-            <v:imagedata r:id="rIdSI73" o:title=""/>
-            <w10:wrap type="none"/>
-          </v:shape>
-          <o:OLEObject Type="Embed" ProgID="ChemDraw.Document" ShapeID="_x0000_i1028" DrawAspect="Content" ObjectID="_1851838596" r:id="rIdSI74"/>
-        </w:object>
-      </w:r>
-    </w:p>
-    <w:p>
-      <w:pPr>
-        <w:spacing w:before="0" w:after="0"/>
-      </w:pPr>
-      <w:r>
-        <w:drawing>
-          <ns1:inline>
-            <ns1:extent cx="5972810" cy="4167444"/>
-            <ns1:docPr id="12" name="Picture 12"/>
-            <ns1:cNvGraphicFramePr>
-              <ns2:graphicFrameLocks noChangeAspect="1"/>
-            </ns1:cNvGraphicFramePr>
-            <ns2:graphic>
-              <ns2:graphicData uri="http://schemas.openxmlformats.org/drawingml/2006/picture">
-                <ns3:pic>
-                  <ns3:nvPicPr>
-                    <ns3:cNvPr id="0" name="2d_13C.png"/>
-                    <ns3:cNvPicPr/>
-                  </ns3:nvPicPr>
-                  <ns3:blipFill>
-                    <ns2:blip r:embed="rId45"/>
                     <ns2:stretch>
                       <ns2:fillRect/>
                     </ns2:stretch>

</xml_diff>